<commit_message>
Revert architecture document to previous version
</commit_message>
<xml_diff>
--- a/Documents/FAZA 1/Архитектура софтверског система.docx
+++ b/Documents/FAZA 1/Архитектура софтверског система.docx
@@ -1315,27 +1315,75 @@
         </w:rPr>
       </w:pPr>
       <w:r>
-        <w:t>Пројекат се развија као React веб апликација за колаборативно UML моделирање у реалном времену. Корисници на заједничкој табли додају, померају и уређују елементе, а комуникација са сервером се одвија преко ASP.NET Core backend-а и SignalR-а.</w:t>
-      </w:r>
-    </w:p>
-    <w:p>
-      <w:pPr>
-        <w:rPr>
-          <w:lang w:val="sr-Cyrl-RS"/>
-        </w:rPr>
-      </w:pPr>
-      <w:r>
-        <w:t>Систем функционише у клијент-server окружењу: React клијент се повезује на централни сервер и преко SignalR канала добија и шаље промене над таблом и chat порукама.</w:t>
-      </w:r>
-    </w:p>
-    <w:p>
-      <w:pPr>
-        <w:rPr>
-          <w:lang w:val="sr-Cyrl-RS"/>
-        </w:rPr>
-      </w:pPr>
-      <w:r>
-        <w:t>Обезбеђује контролу приступа, тако да организатор састанка одређује ко и када може да мења садржај табле.</w:t>
+        <w:rPr>
+          <w:lang w:val="sr-Cyrl-RS"/>
+        </w:rPr>
+        <w:t>Пројекат се развија као интерактивна колаборативна десктопп апликација која омогућава ккорисницима да у реалном времену додају објекте на цртачку таблу и комуницирају путем чета. Апликација је намењена за онлајн састанке, предавања или тимски рад, где више корисника истовремено жели да ради на истој табли.</w:t>
+      </w:r>
+    </w:p>
+    <w:p>
+      <w:pPr>
+        <w:rPr>
+          <w:lang w:val="sr-Cyrl-RS"/>
+        </w:rPr>
+      </w:pPr>
+      <w:r>
+        <w:rPr>
+          <w:lang w:val="sr-Cyrl-RS"/>
+        </w:rPr>
+        <w:t>Систем функционише у дистрибуираном окружењу, са клијентима који се повезују на централни сервер (</w:t>
+      </w:r>
+      <w:r>
+        <w:t>Blackboard</w:t>
+      </w:r>
+      <w:r>
+        <w:rPr>
+          <w:lang w:val="sr-Cyrl-RS"/>
+        </w:rPr>
+        <w:t>)</w:t>
+      </w:r>
+      <w:r>
+        <w:rPr>
+          <w:lang w:val="sr-Cyrl-RS"/>
+        </w:rPr>
+        <w:t xml:space="preserve"> или користе </w:t>
+      </w:r>
+      <w:r>
+        <w:t>message</w:t>
+      </w:r>
+      <w:r>
+        <w:rPr>
+          <w:lang w:val="sr-Cyrl-RS"/>
+        </w:rPr>
+        <w:t xml:space="preserve"> </w:t>
+      </w:r>
+      <w:r>
+        <w:t>broker</w:t>
+      </w:r>
+      <w:r>
+        <w:rPr>
+          <w:lang w:val="sr-Cyrl-RS"/>
+        </w:rPr>
+        <w:t xml:space="preserve"> </w:t>
+      </w:r>
+      <w:r>
+        <w:rPr>
+          <w:lang w:val="sr-Cyrl-RS"/>
+        </w:rPr>
+        <w:t>за рил-тајм синхронизацију.</w:t>
+      </w:r>
+    </w:p>
+    <w:p>
+      <w:pPr>
+        <w:rPr>
+          <w:lang w:val="sr-Cyrl-RS"/>
+        </w:rPr>
+      </w:pPr>
+      <w:r>
+        <w:rPr>
+          <w:lang w:val="sr-Cyrl-RS"/>
+        </w:rPr>
+        <w:t>Обезбеђује контролу приступа, тако да организатор састанка одређује ко и кад може да мења садржај табле.</w:t>
       </w:r>
     </w:p>
     <w:p>
@@ -1361,36 +1409,165 @@
         </w:rPr>
       </w:pPr>
       <w:r>
-        <w:t>Омогућити да више корисника симултано и у реалном времену цртају и раде на заједничкој табли. Имплементирати real-time чет између корисника, како би могли да комуницирају током цртања.</w:t>
-      </w:r>
-    </w:p>
-    <w:p>
-      <w:pPr>
-        <w:rPr>
-          <w:lang w:val="sr-Cyrl-RS"/>
-        </w:rPr>
-      </w:pPr>
-      <w:r>
-        <w:t>Обезбедити перзистенцију промена и undo/redo функционалност, како би се сачувала историја рада и избегао губитак података.</w:t>
-      </w:r>
-    </w:p>
-    <w:p>
-      <w:pPr>
-        <w:rPr>
-          <w:lang w:val="sr-Cyrl-RS"/>
-        </w:rPr>
-      </w:pPr>
-      <w:r>
-        <w:t>Примена архитектурних образаца (client-server, component-based UI, repository и event-driven publish/subscribe) ради модуларности, скалабилности и лаког одржавања.</w:t>
-      </w:r>
-    </w:p>
-    <w:p>
-      <w:pPr>
-        <w:rPr>
-          <w:lang w:val="sr-Cyrl-RS"/>
-        </w:rPr>
-      </w:pPr>
-      <w:r>
+        <w:rPr>
+          <w:lang w:val="sr-Cyrl-RS"/>
+        </w:rPr>
+        <w:t>Омогућити да више корисника симултано и у реалном времену цртају и раде на заједничкој табли. Имплементирати рил-тајм чет између корисника, како би могли да комуницирају током цртања.</w:t>
+      </w:r>
+    </w:p>
+    <w:p>
+      <w:pPr>
+        <w:rPr>
+          <w:lang w:val="sr-Cyrl-RS"/>
+        </w:rPr>
+      </w:pPr>
+      <w:r>
+        <w:rPr>
+          <w:lang w:val="sr-Cyrl-RS"/>
+        </w:rPr>
+        <w:t xml:space="preserve">Обезбедити перзистенцију промена и </w:t>
+      </w:r>
+      <w:r>
+        <w:t>undo</w:t>
+      </w:r>
+      <w:r>
+        <w:rPr>
+          <w:lang w:val="sr-Cyrl-RS"/>
+        </w:rPr>
+        <w:t>/</w:t>
+      </w:r>
+      <w:r>
+        <w:t>redo</w:t>
+      </w:r>
+      <w:r>
+        <w:rPr>
+          <w:lang w:val="sr-Cyrl-RS"/>
+        </w:rPr>
+        <w:t xml:space="preserve"> </w:t>
+      </w:r>
+      <w:r>
+        <w:rPr>
+          <w:lang w:val="sr-Cyrl-RS"/>
+        </w:rPr>
+        <w:t>функционалност, како би се сачувала историја рада и избегао губитак података.</w:t>
+      </w:r>
+    </w:p>
+    <w:p>
+      <w:pPr>
+        <w:rPr>
+          <w:lang w:val="sr-Cyrl-RS"/>
+        </w:rPr>
+      </w:pPr>
+      <w:r>
+        <w:rPr>
+          <w:lang w:val="sr-Cyrl-RS"/>
+        </w:rPr>
+        <w:t xml:space="preserve">Примена архитектурних образаца </w:t>
+      </w:r>
+      <w:r>
+        <w:rPr>
+          <w:lang w:val="sr-Cyrl-RS"/>
+        </w:rPr>
+        <w:t>(</w:t>
+      </w:r>
+      <w:r>
+        <w:t>MVVM</w:t>
+      </w:r>
+      <w:r>
+        <w:rPr>
+          <w:lang w:val="sr-Cyrl-RS"/>
+        </w:rPr>
+        <w:t>/</w:t>
+      </w:r>
+      <w:r>
+        <w:t>MVC</w:t>
+      </w:r>
+      <w:r>
+        <w:rPr>
+          <w:lang w:val="sr-Cyrl-RS"/>
+        </w:rPr>
+        <w:t xml:space="preserve">, </w:t>
+      </w:r>
+      <w:r>
+        <w:t>Blackboard</w:t>
+      </w:r>
+      <w:r>
+        <w:rPr>
+          <w:lang w:val="sr-Cyrl-RS"/>
+        </w:rPr>
+        <w:t xml:space="preserve">, </w:t>
+      </w:r>
+      <w:r>
+        <w:t>push</w:t>
+      </w:r>
+      <w:r>
+        <w:rPr>
+          <w:lang w:val="sr-Cyrl-RS"/>
+        </w:rPr>
+        <w:t xml:space="preserve"> </w:t>
+      </w:r>
+      <w:r>
+        <w:t>type</w:t>
+      </w:r>
+      <w:r>
+        <w:rPr>
+          <w:lang w:val="sr-Cyrl-RS"/>
+        </w:rPr>
+        <w:t xml:space="preserve"> </w:t>
+      </w:r>
+      <w:r>
+        <w:t>Event</w:t>
+      </w:r>
+      <w:r>
+        <w:rPr>
+          <w:lang w:val="sr-Cyrl-RS"/>
+        </w:rPr>
+        <w:t>-</w:t>
+      </w:r>
+      <w:r>
+        <w:t>based</w:t>
+      </w:r>
+      <w:r>
+        <w:rPr>
+          <w:lang w:val="sr-Cyrl-RS"/>
+        </w:rPr>
+        <w:t xml:space="preserve"> </w:t>
+      </w:r>
+      <w:r>
+        <w:t>Implicit</w:t>
+      </w:r>
+      <w:r>
+        <w:rPr>
+          <w:lang w:val="sr-Cyrl-RS"/>
+        </w:rPr>
+        <w:t xml:space="preserve"> </w:t>
+      </w:r>
+      <w:r>
+        <w:t>Invocation</w:t>
+      </w:r>
+      <w:r>
+        <w:rPr>
+          <w:lang w:val="sr-Cyrl-RS"/>
+        </w:rPr>
+        <w:t>)</w:t>
+      </w:r>
+      <w:r>
+        <w:rPr>
+          <w:lang w:val="sr-Cyrl-RS"/>
+        </w:rPr>
+        <w:t xml:space="preserve"> ради модуларности, скалабилности и лаког одржавања.</w:t>
+      </w:r>
+    </w:p>
+    <w:p>
+      <w:pPr>
+        <w:rPr>
+          <w:lang w:val="sr-Cyrl-RS"/>
+        </w:rPr>
+      </w:pPr>
+      <w:r>
+        <w:rPr>
+          <w:lang w:val="sr-Cyrl-RS"/>
+        </w:rPr>
         <w:t>Омогућити једноставно проширење система (нови објекти за цртање, додатне функционалности).</w:t>
       </w:r>
     </w:p>
@@ -2078,36 +2255,49 @@
         </w:rPr>
       </w:pPr>
       <w:r>
-        <w:t>Клијентска апликација мора бити имплементирана као web апликација, коришћењем React, TypeScript, Vite и Tailwind CSS технологија.</w:t>
-      </w:r>
-    </w:p>
-    <w:p>
-      <w:pPr>
-        <w:rPr>
-          <w:lang w:val="sr-Cyrl-RS"/>
-        </w:rPr>
-      </w:pPr>
-      <w:r>
-        <w:t>За организацију корисничког интерфејса и стања користе се React компоненте, контекст и hooks.</w:t>
-      </w:r>
-    </w:p>
-    <w:p>
-      <w:pPr>
-        <w:rPr>
-          <w:lang w:val="sr-Cyrl-RS"/>
-        </w:rPr>
-      </w:pPr>
-      <w:r>
-        <w:t>Комуникација између клијента и сервера мора бити реализована преко ASP.NET Core API-ја и SignalR-а.</w:t>
-      </w:r>
-    </w:p>
-    <w:p>
-      <w:pPr>
-        <w:rPr>
-          <w:lang w:val="sr-Cyrl-RS"/>
-        </w:rPr>
-      </w:pPr>
-      <w:r>
+        <w:rPr>
+          <w:lang w:val="sr-Cyrl-RS"/>
+        </w:rPr>
+        <w:t>Клијентска апликација мора бити имплементирана као desktop апликација, коришћењем C# и WPF технологије.</w:t>
+      </w:r>
+    </w:p>
+    <w:p>
+      <w:pPr>
+        <w:rPr>
+          <w:lang w:val="sr-Cyrl-RS"/>
+        </w:rPr>
+      </w:pPr>
+      <w:r>
+        <w:rPr>
+          <w:lang w:val="sr-Cyrl-RS"/>
+        </w:rPr>
+        <w:t>За организацију корисничког интерфејса и логике мора се применити MVVM архитектурни образац.</w:t>
+      </w:r>
+    </w:p>
+    <w:p>
+      <w:pPr>
+        <w:rPr>
+          <w:lang w:val="sr-Cyrl-RS"/>
+        </w:rPr>
+      </w:pPr>
+      <w:r>
+        <w:rPr>
+          <w:lang w:val="sr-Cyrl-RS"/>
+        </w:rPr>
+        <w:t>Комуникација између клијената и сервера мора бити реализована коришћењем message-passing библиотеке или message broker-а (нпр. ZeroMQ или RabbitMQ).</w:t>
+      </w:r>
+    </w:p>
+    <w:p>
+      <w:pPr>
+        <w:rPr>
+          <w:lang w:val="sr-Cyrl-RS"/>
+        </w:rPr>
+      </w:pPr>
+      <w:r>
+        <w:rPr>
+          <w:lang w:val="sr-Cyrl-RS"/>
+        </w:rPr>
+        <w:lastRenderedPageBreak/>
         <w:t>Серверска компонента мора подржавати event-based publish/subscribe комуникацију у push варијанти.</w:t>
       </w:r>
     </w:p>
@@ -2118,27 +2308,36 @@
         </w:rPr>
       </w:pPr>
       <w:r>
-        <w:t>Систем мора бити доступан преко модерних web прегледача на Windows, Linux и macOS окружењима.</w:t>
-      </w:r>
-    </w:p>
-    <w:p>
-      <w:pPr>
-        <w:rPr>
-          <w:lang w:val="sr-Cyrl-RS"/>
-        </w:rPr>
-      </w:pPr>
-      <w:r>
-        <w:t>Перзистенција података мора бити реализована коришћењем централизоване базе података и серверског слоја за приступ подацима.</w:t>
-      </w:r>
-    </w:p>
-    <w:p>
-      <w:pPr>
-        <w:rPr>
-          <w:lang w:val="sr-Cyrl-RS"/>
-        </w:rPr>
-      </w:pPr>
-      <w:r>
-        <w:t>UI не сме бити блокиран мрежном комуникацијом или обрадом догађаја (асинхрони рад).</w:t>
+        <w:rPr>
+          <w:lang w:val="sr-Cyrl-RS"/>
+        </w:rPr>
+        <w:t>Систем мора бити компатибилан са Windows оперативним системом.</w:t>
+      </w:r>
+    </w:p>
+    <w:p>
+      <w:pPr>
+        <w:rPr>
+          <w:lang w:val="sr-Cyrl-RS"/>
+        </w:rPr>
+      </w:pPr>
+      <w:r>
+        <w:rPr>
+          <w:lang w:val="sr-Cyrl-RS"/>
+        </w:rPr>
+        <w:t>Перзистенција података мора бити реализована коришћењем централизованог repository-ја / базе података.</w:t>
+      </w:r>
+    </w:p>
+    <w:p>
+      <w:pPr>
+        <w:rPr>
+          <w:lang w:val="sr-Cyrl-RS"/>
+        </w:rPr>
+      </w:pPr>
+      <w:r>
+        <w:rPr>
+          <w:lang w:val="sr-Cyrl-RS"/>
+        </w:rPr>
+        <w:t>GUI нит не сме бити блокирана мрежном комуникацијом или обрадом догађаја (асинхрони рад).</w:t>
       </w:r>
     </w:p>
     <w:p>
@@ -2357,7 +2556,38 @@
     </w:p>
     <w:p>
       <w:r>
-        <w:t>Client-Server – Наша апликација је дистрибуирана web апликација са React клијентом и ASP.NET Core сервером.</w:t>
+        <w:rPr>
+          <w:b/>
+          <w:bCs/>
+        </w:rPr>
+        <w:t>Client</w:t>
+      </w:r>
+      <w:r>
+        <w:rPr>
+          <w:b/>
+          <w:bCs/>
+          <w:lang w:val="sr-Cyrl-RS"/>
+        </w:rPr>
+        <w:t>-</w:t>
+      </w:r>
+      <w:r>
+        <w:rPr>
+          <w:b/>
+          <w:bCs/>
+        </w:rPr>
+        <w:t>Server</w:t>
+      </w:r>
+      <w:r>
+        <w:rPr>
+          <w:lang w:val="sr-Cyrl-RS"/>
+        </w:rPr>
+        <w:t xml:space="preserve"> </w:t>
+      </w:r>
+      <w:r>
+        <w:rPr>
+          <w:lang w:val="sr-Cyrl-RS"/>
+        </w:rPr>
+        <w:t>– Наша апликација је дистрибуирана апликација.</w:t>
       </w:r>
     </w:p>
     <w:p>
@@ -2425,52 +2655,294 @@
         </w:rPr>
       </w:pPr>
       <w:r>
-        <w:t>Repository – Образац за централизовано складиштење и приступ подацима преко серверског API-ја и базе података.</w:t>
-      </w:r>
-    </w:p>
-    <w:p>
-      <w:pPr>
-        <w:rPr>
-          <w:lang w:val="sr-Cyrl-RS"/>
-        </w:rPr>
-      </w:pPr>
-    </w:p>
-    <w:p>
-      <w:pPr>
-        <w:rPr>
-          <w:lang w:val="sr-Cyrl-RS"/>
-        </w:rPr>
-      </w:pPr>
-    </w:p>
-    <w:p>
-      <w:pPr>
-        <w:rPr>
-          <w:lang w:val="sr-Cyrl-RS"/>
-        </w:rPr>
-      </w:pPr>
-    </w:p>
-    <w:p>
-      <w:pPr>
-        <w:rPr>
-          <w:lang w:val="sr-Cyrl-RS"/>
-        </w:rPr>
-      </w:pPr>
-    </w:p>
-    <w:p>
-      <w:pPr>
-        <w:rPr>
-          <w:lang w:val="sr-Cyrl-RS"/>
-        </w:rPr>
-      </w:pPr>
-    </w:p>
-    <w:p>
-      <w:pPr>
-        <w:rPr>
-          <w:lang w:val="sr-Cyrl-RS"/>
-        </w:rPr>
-      </w:pPr>
-      <w:r>
-        <w:t>Event-based Implicit Invocation (push) – Када клијент начини промену на табли, SignalR преко push механизма имплицитно обавештава све остале клијенте који приступају истој табли.</w:t>
+        <w:rPr>
+          <w:b/>
+          <w:bCs/>
+        </w:rPr>
+        <w:lastRenderedPageBreak/>
+        <w:t>Repository</w:t>
+      </w:r>
+      <w:r>
+        <w:rPr>
+          <w:lang w:val="sr-Cyrl-RS"/>
+        </w:rPr>
+        <w:t xml:space="preserve"> – </w:t>
+      </w:r>
+      <w:r>
+        <w:rPr>
+          <w:lang w:val="sr-Cyrl-RS"/>
+        </w:rPr>
+        <w:t xml:space="preserve">Образац за складиштење (дељење приступа). Радимо </w:t>
+      </w:r>
+      <w:r>
+        <w:rPr>
+          <w:b/>
+          <w:bCs/>
+        </w:rPr>
+        <w:t>Blackboard</w:t>
+      </w:r>
+      <w:r>
+        <w:rPr>
+          <w:b/>
+          <w:bCs/>
+          <w:lang w:val="sr-Cyrl-RS"/>
+        </w:rPr>
+        <w:t xml:space="preserve"> </w:t>
+      </w:r>
+      <w:r>
+        <w:rPr>
+          <w:lang w:val="sr-Cyrl-RS"/>
+        </w:rPr>
+        <w:t>(активно складиште).</w:t>
+      </w:r>
+      <w:r>
+        <w:rPr>
+          <w:noProof/>
+          <w:lang w:val="sr-Cyrl-RS"/>
+        </w:rPr>
+        <w:drawing>
+          <wp:inline distT="0" distB="0" distL="0" distR="0" wp14:anchorId="51D6B169" wp14:editId="3460EB9A">
+            <wp:extent cx="5943600" cy="6075680"/>
+            <wp:effectExtent l="0" t="0" r="0" b="1270"/>
+            <wp:docPr id="68628008" name="Picture 2"/>
+            <wp:cNvGraphicFramePr>
+              <a:graphicFrameLocks xmlns:a="http://schemas.openxmlformats.org/drawingml/2006/main" noChangeAspect="1"/>
+            </wp:cNvGraphicFramePr>
+            <a:graphic xmlns:a="http://schemas.openxmlformats.org/drawingml/2006/main">
+              <a:graphicData uri="http://schemas.openxmlformats.org/drawingml/2006/picture">
+                <pic:pic xmlns:pic="http://schemas.openxmlformats.org/drawingml/2006/picture">
+                  <pic:nvPicPr>
+                    <pic:cNvPr id="1855047270" name="Picture 1855047270"/>
+                    <pic:cNvPicPr/>
+                  </pic:nvPicPr>
+                  <pic:blipFill>
+                    <a:blip r:embed="rId9">
+                      <a:extLst>
+                        <a:ext uri="{28A0092B-C50C-407E-A947-70E740481C1C}">
+                          <a14:useLocalDpi xmlns:a14="http://schemas.microsoft.com/office/drawing/2010/main" val="0"/>
+                        </a:ext>
+                      </a:extLst>
+                    </a:blip>
+                    <a:stretch>
+                      <a:fillRect/>
+                    </a:stretch>
+                  </pic:blipFill>
+                  <pic:spPr>
+                    <a:xfrm>
+                      <a:off x="0" y="0"/>
+                      <a:ext cx="5943600" cy="6075680"/>
+                    </a:xfrm>
+                    <a:prstGeom prst="rect">
+                      <a:avLst/>
+                    </a:prstGeom>
+                  </pic:spPr>
+                </pic:pic>
+              </a:graphicData>
+            </a:graphic>
+          </wp:inline>
+        </w:drawing>
+      </w:r>
+    </w:p>
+    <w:p>
+      <w:pPr>
+        <w:rPr>
+          <w:lang w:val="sr-Cyrl-RS"/>
+        </w:rPr>
+      </w:pPr>
+    </w:p>
+    <w:p>
+      <w:pPr>
+        <w:rPr>
+          <w:lang w:val="sr-Cyrl-RS"/>
+        </w:rPr>
+      </w:pPr>
+    </w:p>
+    <w:p>
+      <w:pPr>
+        <w:rPr>
+          <w:lang w:val="sr-Cyrl-RS"/>
+        </w:rPr>
+      </w:pPr>
+    </w:p>
+    <w:p>
+      <w:pPr>
+        <w:rPr>
+          <w:lang w:val="sr-Cyrl-RS"/>
+        </w:rPr>
+      </w:pPr>
+    </w:p>
+    <w:p>
+      <w:pPr>
+        <w:rPr>
+          <w:lang w:val="sr-Cyrl-RS"/>
+        </w:rPr>
+      </w:pPr>
+    </w:p>
+    <w:p>
+      <w:pPr>
+        <w:rPr>
+          <w:lang w:val="sr-Cyrl-RS"/>
+        </w:rPr>
+      </w:pPr>
+      <w:r>
+        <w:rPr>
+          <w:b/>
+          <w:bCs/>
+        </w:rPr>
+        <w:lastRenderedPageBreak/>
+        <w:t>Event</w:t>
+      </w:r>
+      <w:r>
+        <w:rPr>
+          <w:b/>
+          <w:bCs/>
+          <w:lang w:val="sr-Cyrl-RS"/>
+        </w:rPr>
+        <w:t>-</w:t>
+      </w:r>
+      <w:r>
+        <w:rPr>
+          <w:b/>
+          <w:bCs/>
+        </w:rPr>
+        <w:t>based</w:t>
+      </w:r>
+      <w:r>
+        <w:rPr>
+          <w:b/>
+          <w:bCs/>
+          <w:lang w:val="sr-Cyrl-RS"/>
+        </w:rPr>
+        <w:t xml:space="preserve"> </w:t>
+      </w:r>
+      <w:r>
+        <w:rPr>
+          <w:b/>
+          <w:bCs/>
+        </w:rPr>
+        <w:t>Implicit</w:t>
+      </w:r>
+      <w:r>
+        <w:rPr>
+          <w:b/>
+          <w:bCs/>
+          <w:lang w:val="sr-Cyrl-RS"/>
+        </w:rPr>
+        <w:t xml:space="preserve"> </w:t>
+      </w:r>
+      <w:r>
+        <w:rPr>
+          <w:b/>
+          <w:bCs/>
+        </w:rPr>
+        <w:t>Invocation</w:t>
+      </w:r>
+      <w:r>
+        <w:rPr>
+          <w:b/>
+          <w:bCs/>
+          <w:lang w:val="sr-Cyrl-RS"/>
+        </w:rPr>
+        <w:t xml:space="preserve"> (</w:t>
+      </w:r>
+      <w:r>
+        <w:rPr>
+          <w:b/>
+          <w:bCs/>
+        </w:rPr>
+        <w:t>push</w:t>
+      </w:r>
+      <w:r>
+        <w:rPr>
+          <w:b/>
+          <w:bCs/>
+          <w:lang w:val="sr-Cyrl-RS"/>
+        </w:rPr>
+        <w:t>)</w:t>
+      </w:r>
+      <w:r>
+        <w:rPr>
+          <w:b/>
+          <w:bCs/>
+          <w:lang w:val="sr-Cyrl-RS"/>
+        </w:rPr>
+        <w:t xml:space="preserve"> </w:t>
+      </w:r>
+      <w:r>
+        <w:rPr>
+          <w:lang w:val="sr-Cyrl-RS"/>
+        </w:rPr>
+        <w:t xml:space="preserve">– Кад клијент начини промену на табли имплицитно се обавештавају сви остали клијенти који приступају истој табли. Радимо </w:t>
+      </w:r>
+      <w:r>
+        <w:rPr>
+          <w:b/>
+          <w:bCs/>
+        </w:rPr>
+        <w:t>Event</w:t>
+      </w:r>
+      <w:r>
+        <w:rPr>
+          <w:b/>
+          <w:bCs/>
+          <w:lang w:val="sr-Cyrl-RS"/>
+        </w:rPr>
+        <w:t>-</w:t>
+      </w:r>
+      <w:r>
+        <w:rPr>
+          <w:b/>
+          <w:bCs/>
+        </w:rPr>
+        <w:t>based</w:t>
+      </w:r>
+      <w:r>
+        <w:rPr>
+          <w:b/>
+          <w:bCs/>
+          <w:lang w:val="sr-Cyrl-RS"/>
+        </w:rPr>
+        <w:t xml:space="preserve"> </w:t>
+      </w:r>
+      <w:r>
+        <w:rPr>
+          <w:lang w:val="sr-Cyrl-RS"/>
+        </w:rPr>
+        <w:t xml:space="preserve">подваријанту и то </w:t>
+      </w:r>
+      <w:r>
+        <w:rPr>
+          <w:b/>
+          <w:bCs/>
+        </w:rPr>
+        <w:t>push</w:t>
+      </w:r>
+      <w:r>
+        <w:rPr>
+          <w:b/>
+          <w:bCs/>
+          <w:lang w:val="sr-Cyrl-RS"/>
+        </w:rPr>
+        <w:t xml:space="preserve"> </w:t>
+      </w:r>
+      <w:r>
+        <w:rPr>
+          <w:lang w:val="sr-Cyrl-RS"/>
+        </w:rPr>
+        <w:t xml:space="preserve">типа јер је циљ да се сви обавесте кад се деси промена и да такорећи цртачка табла одлучује кад ће се то десити (зато је </w:t>
+      </w:r>
+      <w:r>
+        <w:rPr>
+          <w:b/>
+          <w:bCs/>
+        </w:rPr>
+        <w:t>push</w:t>
+      </w:r>
+      <w:r>
+        <w:rPr>
+          <w:lang w:val="sr-Cyrl-RS"/>
+        </w:rPr>
+        <w:t>).</w:t>
       </w:r>
     </w:p>
     <w:p>
@@ -2535,7 +3007,32 @@
         </w:rPr>
       </w:pPr>
       <w:r>
-        <w:t>React компонентна архитектура и једносмерни ток података</w:t>
+        <w:rPr>
+          <w:b/>
+          <w:bCs/>
+        </w:rPr>
+        <w:t>MVV</w:t>
+      </w:r>
+      <w:r>
+        <w:rPr>
+          <w:b/>
+          <w:bCs/>
+        </w:rPr>
+        <w:t>M</w:t>
+      </w:r>
+      <w:r>
+        <w:rPr>
+          <w:b/>
+          <w:bCs/>
+        </w:rPr>
+        <w:t>/MV</w:t>
+      </w:r>
+      <w:r>
+        <w:rPr>
+          <w:b/>
+          <w:bCs/>
+        </w:rPr>
+        <w:t>C</w:t>
       </w:r>
     </w:p>
     <w:p>
@@ -2545,10 +3042,57 @@
           <w:numId w:val="3"/>
         </w:numPr>
       </w:pPr>
-      <w:r>
-        <w:t>Корисник изврши акцију у React компоненти</w:t>
+      <w:proofErr w:type="spellStart"/>
+      <w:r>
+        <w:t>Корисник</w:t>
+      </w:r>
+      <w:proofErr w:type="spellEnd"/>
+      <w:r>
+        <w:t xml:space="preserve"> </w:t>
+      </w:r>
+      <w:proofErr w:type="spellStart"/>
+      <w:r>
+        <w:t>повуче</w:t>
+      </w:r>
+      <w:proofErr w:type="spellEnd"/>
+      <w:r>
+        <w:t xml:space="preserve"> </w:t>
+      </w:r>
+      <w:proofErr w:type="spellStart"/>
+      <w:r>
+        <w:t>линију</w:t>
+      </w:r>
+      <w:proofErr w:type="spellEnd"/>
+      <w:r>
+        <w:t xml:space="preserve"> </w:t>
+      </w:r>
+      <w:proofErr w:type="spellStart"/>
+      <w:r>
+        <w:t>на</w:t>
+      </w:r>
+      <w:proofErr w:type="spellEnd"/>
+      <w:r>
+        <w:t xml:space="preserve"> Canvas-у</w:t>
+      </w:r>
+      <w:r>
         <w:br/>
-        <w:t>(акција у UI-ју)</w:t>
+        <w:t>(</w:t>
+      </w:r>
+      <w:proofErr w:type="spellStart"/>
+      <w:r>
+        <w:t>акција</w:t>
+      </w:r>
+      <w:proofErr w:type="spellEnd"/>
+      <w:r>
+        <w:t xml:space="preserve"> </w:t>
+      </w:r>
+      <w:proofErr w:type="spellStart"/>
+      <w:r>
+        <w:t>мишем</w:t>
+      </w:r>
+      <w:proofErr w:type="spellEnd"/>
+      <w:r>
+        <w:t xml:space="preserve"> у View-у)</w:t>
       </w:r>
     </w:p>
     <w:p>
@@ -2559,9 +3103,107 @@
         </w:numPr>
       </w:pPr>
       <w:r>
-        <w:t>Компонента региструје догађај и позива одговарајући handler</w:t>
+        <w:t xml:space="preserve">View </w:t>
+      </w:r>
+      <w:proofErr w:type="spellStart"/>
+      <w:r>
+        <w:t>региструје</w:t>
+      </w:r>
+      <w:proofErr w:type="spellEnd"/>
+      <w:r>
+        <w:t xml:space="preserve"> </w:t>
+      </w:r>
+      <w:proofErr w:type="spellStart"/>
+      <w:r>
+        <w:t>догађај</w:t>
+      </w:r>
+      <w:proofErr w:type="spellEnd"/>
+      <w:r>
+        <w:t xml:space="preserve"> и </w:t>
+      </w:r>
+      <w:proofErr w:type="spellStart"/>
+      <w:r>
+        <w:t>активира</w:t>
+      </w:r>
+      <w:proofErr w:type="spellEnd"/>
+      <w:r>
+        <w:t xml:space="preserve"> Command</w:t>
+      </w:r>
+      <w:r>
         <w:br/>
-        <w:t>View не садржи пословну логику, већ прослеђује акцију ка state слоју и сервисима.</w:t>
+        <w:t xml:space="preserve">View </w:t>
+      </w:r>
+      <w:proofErr w:type="spellStart"/>
+      <w:r>
+        <w:t>не</w:t>
+      </w:r>
+      <w:proofErr w:type="spellEnd"/>
+      <w:r>
+        <w:t xml:space="preserve"> </w:t>
+      </w:r>
+      <w:proofErr w:type="spellStart"/>
+      <w:r>
+        <w:t>садржи</w:t>
+      </w:r>
+      <w:proofErr w:type="spellEnd"/>
+      <w:r>
+        <w:t xml:space="preserve"> </w:t>
+      </w:r>
+      <w:proofErr w:type="spellStart"/>
+      <w:r>
+        <w:t>пословну</w:t>
+      </w:r>
+      <w:proofErr w:type="spellEnd"/>
+      <w:r>
+        <w:t xml:space="preserve"> </w:t>
+      </w:r>
+      <w:proofErr w:type="spellStart"/>
+      <w:r>
+        <w:t>логику</w:t>
+      </w:r>
+      <w:proofErr w:type="spellEnd"/>
+      <w:r>
+        <w:t xml:space="preserve">, </w:t>
+      </w:r>
+      <w:proofErr w:type="spellStart"/>
+      <w:r>
+        <w:t>већ</w:t>
+      </w:r>
+      <w:proofErr w:type="spellEnd"/>
+      <w:r>
+        <w:t xml:space="preserve"> </w:t>
+      </w:r>
+      <w:proofErr w:type="spellStart"/>
+      <w:r>
+        <w:t>позива</w:t>
+      </w:r>
+      <w:proofErr w:type="spellEnd"/>
+      <w:r>
+        <w:t xml:space="preserve"> </w:t>
+      </w:r>
+      <w:proofErr w:type="spellStart"/>
+      <w:r>
+        <w:t>DrawCommand</w:t>
+      </w:r>
+      <w:proofErr w:type="spellEnd"/>
+      <w:r>
+        <w:t xml:space="preserve"> </w:t>
+      </w:r>
+      <w:proofErr w:type="spellStart"/>
+      <w:r>
+        <w:t>дефинисан</w:t>
+      </w:r>
+      <w:proofErr w:type="spellEnd"/>
+      <w:r>
+        <w:t xml:space="preserve"> у </w:t>
+      </w:r>
+      <w:proofErr w:type="spellStart"/>
+      <w:r>
+        <w:t>ViewModel</w:t>
+      </w:r>
+      <w:proofErr w:type="spellEnd"/>
+      <w:r>
+        <w:t>-у.</w:t>
       </w:r>
     </w:p>
     <w:p>
@@ -2571,10 +3213,128 @@
           <w:numId w:val="3"/>
         </w:numPr>
       </w:pPr>
-      <w:r>
-        <w:t>State се ажурира у Context provider-у или локалном component state-у</w:t>
+      <w:proofErr w:type="spellStart"/>
+      <w:r>
+        <w:t>ViewModel</w:t>
+      </w:r>
+      <w:proofErr w:type="spellEnd"/>
+      <w:r>
+        <w:t xml:space="preserve"> </w:t>
+      </w:r>
+      <w:proofErr w:type="spellStart"/>
+      <w:r>
+        <w:t>прими</w:t>
+      </w:r>
+      <w:proofErr w:type="spellEnd"/>
+      <w:r>
+        <w:t xml:space="preserve"> Command</w:t>
+      </w:r>
+      <w:r>
         <w:br/>
-        <w:t>Компонента припрема податке за нову промену.</w:t>
+      </w:r>
+      <w:proofErr w:type="spellStart"/>
+      <w:r>
+        <w:t>ViewModel</w:t>
+      </w:r>
+      <w:proofErr w:type="spellEnd"/>
+      <w:r>
+        <w:t xml:space="preserve"> </w:t>
+      </w:r>
+      <w:proofErr w:type="spellStart"/>
+      <w:r>
+        <w:t>проверава</w:t>
+      </w:r>
+      <w:proofErr w:type="spellEnd"/>
+      <w:r>
+        <w:t xml:space="preserve"> </w:t>
+      </w:r>
+      <w:proofErr w:type="spellStart"/>
+      <w:r>
+        <w:t>да</w:t>
+      </w:r>
+      <w:proofErr w:type="spellEnd"/>
+      <w:r>
+        <w:t xml:space="preserve"> </w:t>
+      </w:r>
+      <w:proofErr w:type="spellStart"/>
+      <w:r>
+        <w:t>ли</w:t>
+      </w:r>
+      <w:proofErr w:type="spellEnd"/>
+      <w:r>
+        <w:t xml:space="preserve"> </w:t>
+      </w:r>
+      <w:proofErr w:type="spellStart"/>
+      <w:r>
+        <w:t>корисник</w:t>
+      </w:r>
+      <w:proofErr w:type="spellEnd"/>
+      <w:r>
+        <w:t xml:space="preserve"> </w:t>
+      </w:r>
+      <w:proofErr w:type="spellStart"/>
+      <w:r>
+        <w:t>има</w:t>
+      </w:r>
+      <w:proofErr w:type="spellEnd"/>
+      <w:r>
+        <w:t xml:space="preserve"> </w:t>
+      </w:r>
+      <w:proofErr w:type="spellStart"/>
+      <w:r>
+        <w:t>право</w:t>
+      </w:r>
+      <w:proofErr w:type="spellEnd"/>
+      <w:r>
+        <w:t xml:space="preserve"> </w:t>
+      </w:r>
+      <w:proofErr w:type="spellStart"/>
+      <w:r>
+        <w:t>цртања</w:t>
+      </w:r>
+      <w:proofErr w:type="spellEnd"/>
+      <w:r>
+        <w:t xml:space="preserve"> и </w:t>
+      </w:r>
+      <w:proofErr w:type="spellStart"/>
+      <w:r>
+        <w:t>припрема</w:t>
+      </w:r>
+      <w:proofErr w:type="spellEnd"/>
+      <w:r>
+        <w:t xml:space="preserve"> </w:t>
+      </w:r>
+      <w:proofErr w:type="spellStart"/>
+      <w:r>
+        <w:t>податке</w:t>
+      </w:r>
+      <w:proofErr w:type="spellEnd"/>
+      <w:r>
+        <w:t xml:space="preserve"> </w:t>
+      </w:r>
+      <w:proofErr w:type="spellStart"/>
+      <w:r>
+        <w:t>за</w:t>
+      </w:r>
+      <w:proofErr w:type="spellEnd"/>
+      <w:r>
+        <w:t xml:space="preserve"> </w:t>
+      </w:r>
+      <w:proofErr w:type="spellStart"/>
+      <w:r>
+        <w:t>нову</w:t>
+      </w:r>
+      <w:proofErr w:type="spellEnd"/>
+      <w:r>
+        <w:t xml:space="preserve"> </w:t>
+      </w:r>
+      <w:proofErr w:type="spellStart"/>
+      <w:r>
+        <w:t>линију</w:t>
+      </w:r>
+      <w:proofErr w:type="spellEnd"/>
+      <w:r>
+        <w:t>.</w:t>
       </w:r>
     </w:p>
     <w:p>
@@ -2584,10 +3344,96 @@
           <w:numId w:val="3"/>
         </w:numPr>
       </w:pPr>
-      <w:r>
-        <w:t>Handler шаље промену серверу</w:t>
+      <w:proofErr w:type="spellStart"/>
+      <w:r>
+        <w:t>ViewModel</w:t>
+      </w:r>
+      <w:proofErr w:type="spellEnd"/>
+      <w:r>
+        <w:t xml:space="preserve"> </w:t>
+      </w:r>
+      <w:proofErr w:type="spellStart"/>
+      <w:r>
+        <w:t>мења</w:t>
+      </w:r>
+      <w:proofErr w:type="spellEnd"/>
+      <w:r>
+        <w:t xml:space="preserve"> Model</w:t>
+      </w:r>
+      <w:r>
         <w:br/>
-        <w:t>Промена се пакује у захтев и прослеђује преко API service-а и SignalR service-а.</w:t>
+      </w:r>
+      <w:proofErr w:type="spellStart"/>
+      <w:r>
+        <w:t>Креира</w:t>
+      </w:r>
+      <w:proofErr w:type="spellEnd"/>
+      <w:r>
+        <w:t xml:space="preserve"> </w:t>
+      </w:r>
+      <w:proofErr w:type="spellStart"/>
+      <w:r>
+        <w:t>се</w:t>
+      </w:r>
+      <w:proofErr w:type="spellEnd"/>
+      <w:r>
+        <w:t xml:space="preserve"> </w:t>
+      </w:r>
+      <w:proofErr w:type="spellStart"/>
+      <w:r>
+        <w:t>нови</w:t>
+      </w:r>
+      <w:proofErr w:type="spellEnd"/>
+      <w:r>
+        <w:t xml:space="preserve"> </w:t>
+      </w:r>
+      <w:proofErr w:type="spellStart"/>
+      <w:r>
+        <w:t>објекат</w:t>
+      </w:r>
+      <w:proofErr w:type="spellEnd"/>
+      <w:r>
+        <w:t xml:space="preserve"> </w:t>
+      </w:r>
+      <w:proofErr w:type="spellStart"/>
+      <w:r>
+        <w:t>типа</w:t>
+      </w:r>
+      <w:proofErr w:type="spellEnd"/>
+      <w:r>
+        <w:t xml:space="preserve"> Line, </w:t>
+      </w:r>
+      <w:proofErr w:type="spellStart"/>
+      <w:r>
+        <w:t>који</w:t>
+      </w:r>
+      <w:proofErr w:type="spellEnd"/>
+      <w:r>
+        <w:t xml:space="preserve"> </w:t>
+      </w:r>
+      <w:proofErr w:type="spellStart"/>
+      <w:r>
+        <w:t>се</w:t>
+      </w:r>
+      <w:proofErr w:type="spellEnd"/>
+      <w:r>
+        <w:t xml:space="preserve"> </w:t>
+      </w:r>
+      <w:proofErr w:type="spellStart"/>
+      <w:r>
+        <w:t>додаје</w:t>
+      </w:r>
+      <w:proofErr w:type="spellEnd"/>
+      <w:r>
+        <w:t xml:space="preserve"> у </w:t>
+      </w:r>
+      <w:proofErr w:type="spellStart"/>
+      <w:r>
+        <w:t>ObservableCollection</w:t>
+      </w:r>
+      <w:proofErr w:type="spellEnd"/>
+      <w:r>
+        <w:t>&lt;Shape&gt;.</w:t>
       </w:r>
     </w:p>
     <w:p>
@@ -2597,10 +3443,93 @@
           <w:numId w:val="3"/>
         </w:numPr>
       </w:pPr>
-      <w:r>
-        <w:t>UI се аутоматски освежава</w:t>
+      <w:proofErr w:type="spellStart"/>
+      <w:r>
+        <w:t>ViewModel</w:t>
+      </w:r>
+      <w:proofErr w:type="spellEnd"/>
+      <w:r>
+        <w:t xml:space="preserve"> </w:t>
+      </w:r>
+      <w:proofErr w:type="spellStart"/>
+      <w:r>
+        <w:t>шаље</w:t>
+      </w:r>
+      <w:proofErr w:type="spellEnd"/>
+      <w:r>
+        <w:t xml:space="preserve"> </w:t>
+      </w:r>
+      <w:proofErr w:type="spellStart"/>
+      <w:r>
+        <w:t>догађај</w:t>
+      </w:r>
+      <w:proofErr w:type="spellEnd"/>
+      <w:r>
+        <w:t xml:space="preserve"> </w:t>
+      </w:r>
+      <w:proofErr w:type="spellStart"/>
+      <w:r>
+        <w:t>серверу</w:t>
+      </w:r>
+      <w:proofErr w:type="spellEnd"/>
+      <w:r>
         <w:br/>
-        <w:t>Захваљујући React render циклусу, приказ се освежава без ручног освежавања.</w:t>
+      </w:r>
+      <w:proofErr w:type="spellStart"/>
+      <w:r>
+        <w:t>Промена</w:t>
+      </w:r>
+      <w:proofErr w:type="spellEnd"/>
+      <w:r>
+        <w:t xml:space="preserve"> </w:t>
+      </w:r>
+      <w:proofErr w:type="spellStart"/>
+      <w:r>
+        <w:t>се</w:t>
+      </w:r>
+      <w:proofErr w:type="spellEnd"/>
+      <w:r>
+        <w:t xml:space="preserve"> </w:t>
+      </w:r>
+      <w:proofErr w:type="spellStart"/>
+      <w:r>
+        <w:t>пакује</w:t>
+      </w:r>
+      <w:proofErr w:type="spellEnd"/>
+      <w:r>
+        <w:t xml:space="preserve"> у event </w:t>
+      </w:r>
+      <w:proofErr w:type="spellStart"/>
+      <w:r>
+        <w:t>поруку</w:t>
+      </w:r>
+      <w:proofErr w:type="spellEnd"/>
+      <w:r>
+        <w:t xml:space="preserve"> и </w:t>
+      </w:r>
+      <w:proofErr w:type="spellStart"/>
+      <w:r>
+        <w:t>шаље</w:t>
+      </w:r>
+      <w:proofErr w:type="spellEnd"/>
+      <w:r>
+        <w:t xml:space="preserve"> </w:t>
+      </w:r>
+      <w:proofErr w:type="spellStart"/>
+      <w:r>
+        <w:t>преко</w:t>
+      </w:r>
+      <w:proofErr w:type="spellEnd"/>
+      <w:r>
+        <w:t xml:space="preserve"> Communication Layer-а (publish/subscribe, push </w:t>
+      </w:r>
+      <w:proofErr w:type="spellStart"/>
+      <w:r>
+        <w:t>варијанта</w:t>
+      </w:r>
+      <w:proofErr w:type="spellEnd"/>
+      <w:r>
+        <w:t>).</w:t>
       </w:r>
     </w:p>
     <w:p>
@@ -2611,9 +3540,120 @@
         </w:numPr>
       </w:pPr>
       <w:r>
-        <w:t>Остали клијенти добијају догађај (push)</w:t>
+        <w:lastRenderedPageBreak/>
+        <w:t xml:space="preserve">Model </w:t>
+      </w:r>
+      <w:proofErr w:type="spellStart"/>
+      <w:r>
+        <w:t>је</w:t>
+      </w:r>
+      <w:proofErr w:type="spellEnd"/>
+      <w:r>
+        <w:t xml:space="preserve"> </w:t>
+      </w:r>
+      <w:proofErr w:type="spellStart"/>
+      <w:r>
+        <w:t>промењен</w:t>
+      </w:r>
+      <w:proofErr w:type="spellEnd"/>
+      <w:r>
+        <w:t xml:space="preserve"> → View </w:t>
+      </w:r>
+      <w:proofErr w:type="spellStart"/>
+      <w:r>
+        <w:t>се</w:t>
+      </w:r>
+      <w:proofErr w:type="spellEnd"/>
+      <w:r>
+        <w:t xml:space="preserve"> </w:t>
+      </w:r>
+      <w:proofErr w:type="spellStart"/>
+      <w:r>
+        <w:t>аутоматски</w:t>
+      </w:r>
+      <w:proofErr w:type="spellEnd"/>
+      <w:r>
+        <w:t xml:space="preserve"> </w:t>
+      </w:r>
+      <w:proofErr w:type="spellStart"/>
+      <w:r>
+        <w:t>освежава</w:t>
+      </w:r>
+      <w:proofErr w:type="spellEnd"/>
+      <w:r>
         <w:br/>
-        <w:t>Њихов локални state се синхронизује након SignalR поруке.</w:t>
+      </w:r>
+      <w:proofErr w:type="spellStart"/>
+      <w:r>
+        <w:t>Захваљујући</w:t>
+      </w:r>
+      <w:proofErr w:type="spellEnd"/>
+      <w:r>
+        <w:t xml:space="preserve"> data binding </w:t>
+      </w:r>
+      <w:proofErr w:type="spellStart"/>
+      <w:r>
+        <w:t>механизму</w:t>
+      </w:r>
+      <w:proofErr w:type="spellEnd"/>
+      <w:r>
+        <w:t xml:space="preserve">, View </w:t>
+      </w:r>
+      <w:proofErr w:type="spellStart"/>
+      <w:r>
+        <w:t>аутоматски</w:t>
+      </w:r>
+      <w:proofErr w:type="spellEnd"/>
+      <w:r>
+        <w:t xml:space="preserve"> </w:t>
+      </w:r>
+      <w:proofErr w:type="spellStart"/>
+      <w:r>
+        <w:t>приказује</w:t>
+      </w:r>
+      <w:proofErr w:type="spellEnd"/>
+      <w:r>
+        <w:t xml:space="preserve"> </w:t>
+      </w:r>
+      <w:proofErr w:type="spellStart"/>
+      <w:r>
+        <w:t>нову</w:t>
+      </w:r>
+      <w:proofErr w:type="spellEnd"/>
+      <w:r>
+        <w:t xml:space="preserve"> </w:t>
+      </w:r>
+      <w:proofErr w:type="spellStart"/>
+      <w:r>
+        <w:t>линију</w:t>
+      </w:r>
+      <w:proofErr w:type="spellEnd"/>
+      <w:r>
+        <w:t xml:space="preserve"> </w:t>
+      </w:r>
+      <w:proofErr w:type="spellStart"/>
+      <w:r>
+        <w:t>без</w:t>
+      </w:r>
+      <w:proofErr w:type="spellEnd"/>
+      <w:r>
+        <w:t xml:space="preserve"> </w:t>
+      </w:r>
+      <w:proofErr w:type="spellStart"/>
+      <w:r>
+        <w:t>ручног</w:t>
+      </w:r>
+      <w:proofErr w:type="spellEnd"/>
+      <w:r>
+        <w:t xml:space="preserve"> </w:t>
+      </w:r>
+      <w:proofErr w:type="spellStart"/>
+      <w:r>
+        <w:t>освежавања</w:t>
+      </w:r>
+      <w:proofErr w:type="spellEnd"/>
+      <w:r>
+        <w:t>.</w:t>
       </w:r>
     </w:p>
     <w:p>
@@ -2623,8 +3663,112 @@
           <w:numId w:val="3"/>
         </w:numPr>
       </w:pPr>
-      <w:r>
-        <w:t>Један те исти state извор користи се за приказ табли, чета и осталих real-time података.</w:t>
+      <w:proofErr w:type="spellStart"/>
+      <w:r>
+        <w:t>Остали</w:t>
+      </w:r>
+      <w:proofErr w:type="spellEnd"/>
+      <w:r>
+        <w:t xml:space="preserve"> </w:t>
+      </w:r>
+      <w:proofErr w:type="spellStart"/>
+      <w:r>
+        <w:t>клијенти</w:t>
+      </w:r>
+      <w:proofErr w:type="spellEnd"/>
+      <w:r>
+        <w:t xml:space="preserve"> </w:t>
+      </w:r>
+      <w:proofErr w:type="spellStart"/>
+      <w:r>
+        <w:t>добијају</w:t>
+      </w:r>
+      <w:proofErr w:type="spellEnd"/>
+      <w:r>
+        <w:t xml:space="preserve"> </w:t>
+      </w:r>
+      <w:proofErr w:type="spellStart"/>
+      <w:r>
+        <w:t>догађај</w:t>
+      </w:r>
+      <w:proofErr w:type="spellEnd"/>
+      <w:r>
+        <w:t xml:space="preserve"> (push)</w:t>
+      </w:r>
+      <w:r>
+        <w:br/>
+      </w:r>
+      <w:proofErr w:type="spellStart"/>
+      <w:r>
+        <w:t>Њихов</w:t>
+      </w:r>
+      <w:proofErr w:type="spellEnd"/>
+      <w:r>
+        <w:t xml:space="preserve"> </w:t>
+      </w:r>
+      <w:proofErr w:type="spellStart"/>
+      <w:r>
+        <w:t>ViewModel</w:t>
+      </w:r>
+      <w:proofErr w:type="spellEnd"/>
+      <w:r>
+        <w:t xml:space="preserve"> </w:t>
+      </w:r>
+      <w:proofErr w:type="spellStart"/>
+      <w:r>
+        <w:t>ажурира</w:t>
+      </w:r>
+      <w:proofErr w:type="spellEnd"/>
+      <w:r>
+        <w:t xml:space="preserve"> Model, </w:t>
+      </w:r>
+      <w:proofErr w:type="spellStart"/>
+      <w:r>
+        <w:t>након</w:t>
+      </w:r>
+      <w:proofErr w:type="spellEnd"/>
+      <w:r>
+        <w:t xml:space="preserve"> </w:t>
+      </w:r>
+      <w:proofErr w:type="spellStart"/>
+      <w:r>
+        <w:t>чега</w:t>
+      </w:r>
+      <w:proofErr w:type="spellEnd"/>
+      <w:r>
+        <w:t xml:space="preserve"> </w:t>
+      </w:r>
+      <w:proofErr w:type="spellStart"/>
+      <w:r>
+        <w:t>се</w:t>
+      </w:r>
+      <w:proofErr w:type="spellEnd"/>
+      <w:r>
+        <w:t xml:space="preserve"> </w:t>
+      </w:r>
+      <w:proofErr w:type="spellStart"/>
+      <w:r>
+        <w:t>њихов</w:t>
+      </w:r>
+      <w:proofErr w:type="spellEnd"/>
+      <w:r>
+        <w:t xml:space="preserve"> View </w:t>
+      </w:r>
+      <w:proofErr w:type="spellStart"/>
+      <w:r>
+        <w:t>аутоматски</w:t>
+      </w:r>
+      <w:proofErr w:type="spellEnd"/>
+      <w:r>
+        <w:t xml:space="preserve"> </w:t>
+      </w:r>
+      <w:proofErr w:type="spellStart"/>
+      <w:r>
+        <w:t>освежава</w:t>
+      </w:r>
+      <w:proofErr w:type="spellEnd"/>
+      <w:r>
+        <w:t>.</w:t>
       </w:r>
     </w:p>
     <w:p>
@@ -2845,19 +3989,120 @@
         </w:rPr>
       </w:pPr>
       <w:r>
-        <w:t>1. Клијентска компонента (web апликација)</w:t>
-      </w:r>
-    </w:p>
-    <w:p>
-      <w:pPr>
-        <w:rPr>
-          <w:lang w:val="sr-Cyrl-RS"/>
-        </w:rPr>
-      </w:pPr>
-      <w:r>
-        <w:t>Језик: TypeScript</w:t>
+        <w:rPr>
+          <w:b/>
+          <w:bCs/>
+          <w:lang w:val="sr-Cyrl-RS"/>
+        </w:rPr>
+        <w:t>1. Клијентска компонента (</w:t>
+      </w:r>
+      <w:r>
+        <w:rPr>
+          <w:b/>
+          <w:bCs/>
+        </w:rPr>
+        <w:t>desktop</w:t>
+      </w:r>
+      <w:r>
+        <w:rPr>
+          <w:b/>
+          <w:bCs/>
+          <w:lang w:val="sr-Cyrl-RS"/>
+        </w:rPr>
+        <w:t xml:space="preserve"> апликација)</w:t>
+      </w:r>
+    </w:p>
+    <w:p>
+      <w:pPr>
+        <w:rPr>
+          <w:lang w:val="sr-Cyrl-RS"/>
+        </w:rPr>
+      </w:pPr>
+      <w:r>
+        <w:rPr>
+          <w:b/>
+          <w:bCs/>
+          <w:lang w:val="sr-Cyrl-RS"/>
+        </w:rPr>
+        <w:t>Језик:</w:t>
+      </w:r>
+      <w:r>
+        <w:rPr>
+          <w:lang w:val="sr-Cyrl-RS"/>
+        </w:rPr>
+        <w:t xml:space="preserve"> </w:t>
+      </w:r>
+      <w:r>
+        <w:t>C</w:t>
+      </w:r>
+      <w:r>
+        <w:rPr>
+          <w:lang w:val="sr-Cyrl-RS"/>
+        </w:rPr>
+        <w:t>#</w:t>
+      </w:r>
+      <w:r>
+        <w:rPr>
+          <w:lang w:val="sr-Cyrl-RS"/>
+        </w:rPr>
         <w:br/>
-        <w:t>Framework: React + Vite</w:t>
+      </w:r>
+      <w:r>
+        <w:rPr>
+          <w:b/>
+          <w:bCs/>
+        </w:rPr>
+        <w:t>Framework</w:t>
+      </w:r>
+      <w:r>
+        <w:rPr>
+          <w:b/>
+          <w:bCs/>
+          <w:lang w:val="sr-Cyrl-RS"/>
+        </w:rPr>
+        <w:t>:</w:t>
+      </w:r>
+      <w:r>
+        <w:rPr>
+          <w:lang w:val="sr-Cyrl-RS"/>
+        </w:rPr>
+        <w:t xml:space="preserve"> </w:t>
+      </w:r>
+      <w:r>
+        <w:t>WPF</w:t>
+      </w:r>
+      <w:r>
+        <w:rPr>
+          <w:lang w:val="sr-Cyrl-RS"/>
+        </w:rPr>
+        <w:t xml:space="preserve"> (</w:t>
+      </w:r>
+      <w:r>
+        <w:t>Windows</w:t>
+      </w:r>
+      <w:r>
+        <w:rPr>
+          <w:lang w:val="sr-Cyrl-RS"/>
+        </w:rPr>
+        <w:t xml:space="preserve"> </w:t>
+      </w:r>
+      <w:r>
+        <w:t>Presentation</w:t>
+      </w:r>
+      <w:r>
+        <w:rPr>
+          <w:lang w:val="sr-Cyrl-RS"/>
+        </w:rPr>
+        <w:t xml:space="preserve"> </w:t>
+      </w:r>
+      <w:r>
+        <w:t>Foundation</w:t>
+      </w:r>
+      <w:r>
+        <w:rPr>
+          <w:lang w:val="sr-Cyrl-RS"/>
+        </w:rPr>
+        <w:t>)</w:t>
       </w:r>
     </w:p>
     <w:p>
@@ -2907,8 +4152,77 @@
           <w:numId w:val="13"/>
         </w:numPr>
       </w:pPr>
-      <w:r>
-        <w:t>Модеран и интерактиван кориснички интерфејс за UML моделовање са React компонентама, Canvas/SVG приказом и стилизованим контролама.</w:t>
+      <w:proofErr w:type="spellStart"/>
+      <w:r>
+        <w:t>Модеран</w:t>
+      </w:r>
+      <w:proofErr w:type="spellEnd"/>
+      <w:r>
+        <w:t xml:space="preserve"> </w:t>
+      </w:r>
+      <w:proofErr w:type="spellStart"/>
+      <w:r>
+        <w:t>графички</w:t>
+      </w:r>
+      <w:proofErr w:type="spellEnd"/>
+      <w:r>
+        <w:t xml:space="preserve"> </w:t>
+      </w:r>
+      <w:proofErr w:type="spellStart"/>
+      <w:r>
+        <w:t>кориснички</w:t>
+      </w:r>
+      <w:proofErr w:type="spellEnd"/>
+      <w:r>
+        <w:t xml:space="preserve"> </w:t>
+      </w:r>
+      <w:proofErr w:type="spellStart"/>
+      <w:r>
+        <w:t>интерфејс</w:t>
+      </w:r>
+      <w:proofErr w:type="spellEnd"/>
+      <w:r>
+        <w:t xml:space="preserve"> </w:t>
+      </w:r>
+      <w:proofErr w:type="spellStart"/>
+      <w:r>
+        <w:t>са</w:t>
+      </w:r>
+      <w:proofErr w:type="spellEnd"/>
+      <w:r>
+        <w:t xml:space="preserve"> </w:t>
+      </w:r>
+      <w:proofErr w:type="spellStart"/>
+      <w:r>
+        <w:t>подршком</w:t>
+      </w:r>
+      <w:proofErr w:type="spellEnd"/>
+      <w:r>
+        <w:t xml:space="preserve"> </w:t>
+      </w:r>
+      <w:proofErr w:type="spellStart"/>
+      <w:r>
+        <w:t>за</w:t>
+      </w:r>
+      <w:proofErr w:type="spellEnd"/>
+      <w:r>
+        <w:t xml:space="preserve"> Canvas, toolbar и </w:t>
+      </w:r>
+      <w:proofErr w:type="spellStart"/>
+      <w:r>
+        <w:t>стилизоване</w:t>
+      </w:r>
+      <w:proofErr w:type="spellEnd"/>
+      <w:r>
+        <w:t xml:space="preserve"> </w:t>
+      </w:r>
+      <w:proofErr w:type="spellStart"/>
+      <w:r>
+        <w:t>контроле</w:t>
+      </w:r>
+      <w:proofErr w:type="spellEnd"/>
+      <w:r>
+        <w:t>.</w:t>
       </w:r>
     </w:p>
     <w:p>
@@ -2918,8 +4232,111 @@
           <w:numId w:val="13"/>
         </w:numPr>
       </w:pPr>
-      <w:r>
-        <w:t>Једноставна организација UI-ја кроз компоненте, context и hooks, што омогућава јасну сепарацију приказа и стања.</w:t>
+      <w:proofErr w:type="spellStart"/>
+      <w:r>
+        <w:t>Једноставна</w:t>
+      </w:r>
+      <w:proofErr w:type="spellEnd"/>
+      <w:r>
+        <w:t xml:space="preserve"> </w:t>
+      </w:r>
+      <w:proofErr w:type="spellStart"/>
+      <w:r>
+        <w:t>имплементација</w:t>
+      </w:r>
+      <w:proofErr w:type="spellEnd"/>
+      <w:r>
+        <w:t xml:space="preserve"> </w:t>
+      </w:r>
+      <w:r>
+        <w:rPr>
+          <w:b/>
+          <w:bCs/>
+        </w:rPr>
+        <w:t xml:space="preserve">MVVM </w:t>
+      </w:r>
+      <w:proofErr w:type="spellStart"/>
+      <w:r>
+        <w:rPr>
+          <w:b/>
+          <w:bCs/>
+        </w:rPr>
+        <w:t>обрасца</w:t>
+      </w:r>
+      <w:proofErr w:type="spellEnd"/>
+      <w:r>
+        <w:rPr>
+          <w:b/>
+          <w:bCs/>
+        </w:rPr>
+        <w:t xml:space="preserve"> (Model–View–</w:t>
+      </w:r>
+      <w:proofErr w:type="spellStart"/>
+      <w:r>
+        <w:rPr>
+          <w:b/>
+          <w:bCs/>
+        </w:rPr>
+        <w:t>ViewModel</w:t>
+      </w:r>
+      <w:proofErr w:type="spellEnd"/>
+      <w:r>
+        <w:rPr>
+          <w:b/>
+          <w:bCs/>
+        </w:rPr>
+        <w:t>)</w:t>
+      </w:r>
+      <w:r>
+        <w:t xml:space="preserve">, </w:t>
+      </w:r>
+      <w:proofErr w:type="spellStart"/>
+      <w:r>
+        <w:t>што</w:t>
+      </w:r>
+      <w:proofErr w:type="spellEnd"/>
+      <w:r>
+        <w:t xml:space="preserve"> </w:t>
+      </w:r>
+      <w:proofErr w:type="spellStart"/>
+      <w:r>
+        <w:t>омогућава</w:t>
+      </w:r>
+      <w:proofErr w:type="spellEnd"/>
+      <w:r>
+        <w:t xml:space="preserve"> </w:t>
+      </w:r>
+      <w:proofErr w:type="spellStart"/>
+      <w:r>
+        <w:t>јасну</w:t>
+      </w:r>
+      <w:proofErr w:type="spellEnd"/>
+      <w:r>
+        <w:t xml:space="preserve"> </w:t>
+      </w:r>
+      <w:proofErr w:type="spellStart"/>
+      <w:r>
+        <w:t>сепарацију</w:t>
+      </w:r>
+      <w:proofErr w:type="spellEnd"/>
+      <w:r>
+        <w:t xml:space="preserve"> GUI-</w:t>
+      </w:r>
+      <w:proofErr w:type="spellStart"/>
+      <w:r>
+        <w:t>ја</w:t>
+      </w:r>
+      <w:proofErr w:type="spellEnd"/>
+      <w:r>
+        <w:t xml:space="preserve"> и </w:t>
+      </w:r>
+      <w:proofErr w:type="spellStart"/>
+      <w:r>
+        <w:t>логике</w:t>
+      </w:r>
+      <w:proofErr w:type="spellEnd"/>
+      <w:r>
+        <w:t>.</w:t>
       </w:r>
     </w:p>
     <w:p>
@@ -2929,19 +4346,175 @@
           <w:numId w:val="13"/>
         </w:numPr>
       </w:pPr>
-      <w:r>
-        <w:t>Одлична подршка за јасан и предвидљив state flow, што омогућава аутоматско освежавање приказа при променама стања.</w:t>
-      </w:r>
-    </w:p>
-    <w:p>
-      <w:pPr>
-        <w:rPr>
-          <w:b/>
-          <w:bCs/>
-        </w:rPr>
-      </w:pPr>
-      <w:r>
-        <w:t>Обрасци који се примењују на клијенту:</w:t>
+      <w:proofErr w:type="spellStart"/>
+      <w:r>
+        <w:t>Одлична</w:t>
+      </w:r>
+      <w:proofErr w:type="spellEnd"/>
+      <w:r>
+        <w:t xml:space="preserve"> </w:t>
+      </w:r>
+      <w:proofErr w:type="spellStart"/>
+      <w:r>
+        <w:t>подршка</w:t>
+      </w:r>
+      <w:proofErr w:type="spellEnd"/>
+      <w:r>
+        <w:t xml:space="preserve"> </w:t>
+      </w:r>
+      <w:proofErr w:type="spellStart"/>
+      <w:r>
+        <w:t>за</w:t>
+      </w:r>
+      <w:proofErr w:type="spellEnd"/>
+      <w:r>
+        <w:t xml:space="preserve"> </w:t>
+      </w:r>
+      <w:r>
+        <w:rPr>
+          <w:b/>
+          <w:bCs/>
+        </w:rPr>
+        <w:t>data binding</w:t>
+      </w:r>
+      <w:r>
+        <w:t xml:space="preserve">, </w:t>
+      </w:r>
+      <w:proofErr w:type="spellStart"/>
+      <w:r>
+        <w:t>што</w:t>
+      </w:r>
+      <w:proofErr w:type="spellEnd"/>
+      <w:r>
+        <w:t xml:space="preserve"> </w:t>
+      </w:r>
+      <w:proofErr w:type="spellStart"/>
+      <w:r>
+        <w:t>омогућава</w:t>
+      </w:r>
+      <w:proofErr w:type="spellEnd"/>
+      <w:r>
+        <w:t xml:space="preserve"> </w:t>
+      </w:r>
+      <w:proofErr w:type="spellStart"/>
+      <w:r>
+        <w:t>аутоматско</w:t>
+      </w:r>
+      <w:proofErr w:type="spellEnd"/>
+      <w:r>
+        <w:t xml:space="preserve"> </w:t>
+      </w:r>
+      <w:proofErr w:type="spellStart"/>
+      <w:r>
+        <w:t>освежавање</w:t>
+      </w:r>
+      <w:proofErr w:type="spellEnd"/>
+      <w:r>
+        <w:t xml:space="preserve"> View-а </w:t>
+      </w:r>
+      <w:proofErr w:type="spellStart"/>
+      <w:r>
+        <w:t>при</w:t>
+      </w:r>
+      <w:proofErr w:type="spellEnd"/>
+      <w:r>
+        <w:t xml:space="preserve"> </w:t>
+      </w:r>
+      <w:proofErr w:type="spellStart"/>
+      <w:r>
+        <w:t>променама</w:t>
+      </w:r>
+      <w:proofErr w:type="spellEnd"/>
+      <w:r>
+        <w:t xml:space="preserve"> у Model-у.</w:t>
+      </w:r>
+    </w:p>
+    <w:p>
+      <w:pPr>
+        <w:rPr>
+          <w:b/>
+          <w:bCs/>
+        </w:rPr>
+      </w:pPr>
+      <w:proofErr w:type="spellStart"/>
+      <w:r>
+        <w:rPr>
+          <w:b/>
+          <w:bCs/>
+        </w:rPr>
+        <w:t>Обрасци</w:t>
+      </w:r>
+      <w:proofErr w:type="spellEnd"/>
+      <w:r>
+        <w:rPr>
+          <w:b/>
+          <w:bCs/>
+        </w:rPr>
+        <w:t xml:space="preserve"> </w:t>
+      </w:r>
+      <w:proofErr w:type="spellStart"/>
+      <w:r>
+        <w:rPr>
+          <w:b/>
+          <w:bCs/>
+        </w:rPr>
+        <w:t>који</w:t>
+      </w:r>
+      <w:proofErr w:type="spellEnd"/>
+      <w:r>
+        <w:rPr>
+          <w:b/>
+          <w:bCs/>
+        </w:rPr>
+        <w:t xml:space="preserve"> </w:t>
+      </w:r>
+      <w:proofErr w:type="spellStart"/>
+      <w:r>
+        <w:rPr>
+          <w:b/>
+          <w:bCs/>
+        </w:rPr>
+        <w:t>се</w:t>
+      </w:r>
+      <w:proofErr w:type="spellEnd"/>
+      <w:r>
+        <w:rPr>
+          <w:b/>
+          <w:bCs/>
+        </w:rPr>
+        <w:t xml:space="preserve"> </w:t>
+      </w:r>
+      <w:proofErr w:type="spellStart"/>
+      <w:r>
+        <w:rPr>
+          <w:b/>
+          <w:bCs/>
+        </w:rPr>
+        <w:t>примењују</w:t>
+      </w:r>
+      <w:proofErr w:type="spellEnd"/>
+      <w:r>
+        <w:rPr>
+          <w:b/>
+          <w:bCs/>
+        </w:rPr>
+        <w:t xml:space="preserve"> у </w:t>
+      </w:r>
+      <w:proofErr w:type="spellStart"/>
+      <w:r>
+        <w:rPr>
+          <w:b/>
+          <w:bCs/>
+        </w:rPr>
+        <w:t>клијенту</w:t>
+      </w:r>
+      <w:proofErr w:type="spellEnd"/>
+      <w:r>
+        <w:rPr>
+          <w:b/>
+          <w:bCs/>
+        </w:rPr>
+        <w:t>:</w:t>
       </w:r>
     </w:p>
     <w:p>
@@ -2952,7 +4525,27 @@
         </w:numPr>
       </w:pPr>
       <w:r>
-        <w:t>Component-based UI образац:</w:t>
+        <w:rPr>
+          <w:b/>
+          <w:bCs/>
+        </w:rPr>
+        <w:t xml:space="preserve">MVVM </w:t>
+      </w:r>
+      <w:proofErr w:type="spellStart"/>
+      <w:r>
+        <w:rPr>
+          <w:b/>
+          <w:bCs/>
+        </w:rPr>
+        <w:t>образац</w:t>
+      </w:r>
+      <w:proofErr w:type="spellEnd"/>
+      <w:r>
+        <w:rPr>
+          <w:b/>
+          <w:bCs/>
+        </w:rPr>
+        <w:t>:</w:t>
       </w:r>
     </w:p>
     <w:p>
@@ -2963,7 +4556,62 @@
         </w:numPr>
       </w:pPr>
       <w:r>
-        <w:t>Component: приказује стање табле, chat порука и корисничких права.</w:t>
+        <w:rPr>
+          <w:b/>
+          <w:bCs/>
+        </w:rPr>
+        <w:t>Model:</w:t>
+      </w:r>
+      <w:r>
+        <w:t xml:space="preserve"> </w:t>
+      </w:r>
+      <w:proofErr w:type="spellStart"/>
+      <w:r>
+        <w:t>чува</w:t>
+      </w:r>
+      <w:proofErr w:type="spellEnd"/>
+      <w:r>
+        <w:t xml:space="preserve"> </w:t>
+      </w:r>
+      <w:proofErr w:type="spellStart"/>
+      <w:r>
+        <w:t>стање</w:t>
+      </w:r>
+      <w:proofErr w:type="spellEnd"/>
+      <w:r>
+        <w:t xml:space="preserve"> </w:t>
+      </w:r>
+      <w:proofErr w:type="spellStart"/>
+      <w:r>
+        <w:t>табле</w:t>
+      </w:r>
+      <w:proofErr w:type="spellEnd"/>
+      <w:r>
+        <w:t xml:space="preserve">, chat </w:t>
+      </w:r>
+      <w:proofErr w:type="spellStart"/>
+      <w:r>
+        <w:t>порука</w:t>
+      </w:r>
+      <w:proofErr w:type="spellEnd"/>
+      <w:r>
+        <w:t xml:space="preserve"> и </w:t>
+      </w:r>
+      <w:proofErr w:type="spellStart"/>
+      <w:r>
+        <w:t>корисничких</w:t>
+      </w:r>
+      <w:proofErr w:type="spellEnd"/>
+      <w:r>
+        <w:t xml:space="preserve"> </w:t>
+      </w:r>
+      <w:proofErr w:type="spellStart"/>
+      <w:r>
+        <w:t>права</w:t>
+      </w:r>
+      <w:proofErr w:type="spellEnd"/>
+      <w:r>
+        <w:t>.</w:t>
       </w:r>
     </w:p>
     <w:p>
@@ -2973,8 +4621,88 @@
           <w:numId w:val="14"/>
         </w:numPr>
       </w:pPr>
-      <w:r>
-        <w:t>State/Context: чува и дистрибуира стање кроз апликацију и обрађује долазне event-е са сервера.</w:t>
+      <w:proofErr w:type="spellStart"/>
+      <w:r>
+        <w:rPr>
+          <w:b/>
+          <w:bCs/>
+        </w:rPr>
+        <w:t>ViewModel</w:t>
+      </w:r>
+      <w:proofErr w:type="spellEnd"/>
+      <w:r>
+        <w:rPr>
+          <w:b/>
+          <w:bCs/>
+        </w:rPr>
+        <w:t>:</w:t>
+      </w:r>
+      <w:r>
+        <w:t xml:space="preserve"> </w:t>
+      </w:r>
+      <w:proofErr w:type="spellStart"/>
+      <w:r>
+        <w:t>прима</w:t>
+      </w:r>
+      <w:proofErr w:type="spellEnd"/>
+      <w:r>
+        <w:t xml:space="preserve"> </w:t>
+      </w:r>
+      <w:proofErr w:type="spellStart"/>
+      <w:r>
+        <w:t>догађаје</w:t>
+      </w:r>
+      <w:proofErr w:type="spellEnd"/>
+      <w:r>
+        <w:t xml:space="preserve"> </w:t>
+      </w:r>
+      <w:proofErr w:type="spellStart"/>
+      <w:r>
+        <w:t>из</w:t>
+      </w:r>
+      <w:proofErr w:type="spellEnd"/>
+      <w:r>
+        <w:t xml:space="preserve"> View-а, </w:t>
+      </w:r>
+      <w:proofErr w:type="spellStart"/>
+      <w:r>
+        <w:t>ажурира</w:t>
+      </w:r>
+      <w:proofErr w:type="spellEnd"/>
+      <w:r>
+        <w:t xml:space="preserve"> Model и </w:t>
+      </w:r>
+      <w:proofErr w:type="spellStart"/>
+      <w:r>
+        <w:t>обрађује</w:t>
+      </w:r>
+      <w:proofErr w:type="spellEnd"/>
+      <w:r>
+        <w:t xml:space="preserve"> </w:t>
+      </w:r>
+      <w:proofErr w:type="spellStart"/>
+      <w:r>
+        <w:t>долазне</w:t>
+      </w:r>
+      <w:proofErr w:type="spellEnd"/>
+      <w:r>
+        <w:t xml:space="preserve"> event-е </w:t>
+      </w:r>
+      <w:proofErr w:type="spellStart"/>
+      <w:r>
+        <w:t>са</w:t>
+      </w:r>
+      <w:proofErr w:type="spellEnd"/>
+      <w:r>
+        <w:t xml:space="preserve"> </w:t>
+      </w:r>
+      <w:proofErr w:type="spellStart"/>
+      <w:r>
+        <w:t>сервера</w:t>
+      </w:r>
+      <w:proofErr w:type="spellEnd"/>
+      <w:r>
+        <w:t>.</w:t>
       </w:r>
     </w:p>
     <w:p>
@@ -2985,7 +4713,87 @@
         </w:numPr>
       </w:pPr>
       <w:r>
-        <w:t>View: Canvas, chat прозор и toolbar, који се аутоматски освежавају при променама у state-у.</w:t>
+        <w:rPr>
+          <w:b/>
+          <w:bCs/>
+        </w:rPr>
+        <w:lastRenderedPageBreak/>
+        <w:t>View:</w:t>
+      </w:r>
+      <w:r>
+        <w:t xml:space="preserve"> Canvas </w:t>
+      </w:r>
+      <w:proofErr w:type="spellStart"/>
+      <w:r>
+        <w:t>за</w:t>
+      </w:r>
+      <w:proofErr w:type="spellEnd"/>
+      <w:r>
+        <w:t xml:space="preserve"> </w:t>
+      </w:r>
+      <w:proofErr w:type="spellStart"/>
+      <w:r>
+        <w:t>цртање</w:t>
+      </w:r>
+      <w:proofErr w:type="spellEnd"/>
+      <w:r>
+        <w:t xml:space="preserve">, chat </w:t>
+      </w:r>
+      <w:proofErr w:type="spellStart"/>
+      <w:r>
+        <w:t>прозор</w:t>
+      </w:r>
+      <w:proofErr w:type="spellEnd"/>
+      <w:r>
+        <w:t xml:space="preserve"> и toolbar, </w:t>
+      </w:r>
+      <w:proofErr w:type="spellStart"/>
+      <w:r>
+        <w:t>који</w:t>
+      </w:r>
+      <w:proofErr w:type="spellEnd"/>
+      <w:r>
+        <w:t xml:space="preserve"> </w:t>
+      </w:r>
+      <w:proofErr w:type="spellStart"/>
+      <w:r>
+        <w:t>се</w:t>
+      </w:r>
+      <w:proofErr w:type="spellEnd"/>
+      <w:r>
+        <w:t xml:space="preserve"> </w:t>
+      </w:r>
+      <w:proofErr w:type="spellStart"/>
+      <w:r>
+        <w:t>аутоматски</w:t>
+      </w:r>
+      <w:proofErr w:type="spellEnd"/>
+      <w:r>
+        <w:t xml:space="preserve"> </w:t>
+      </w:r>
+      <w:proofErr w:type="spellStart"/>
+      <w:r>
+        <w:t>освежавају</w:t>
+      </w:r>
+      <w:proofErr w:type="spellEnd"/>
+      <w:r>
+        <w:t xml:space="preserve"> </w:t>
+      </w:r>
+      <w:proofErr w:type="spellStart"/>
+      <w:r>
+        <w:t>при</w:t>
+      </w:r>
+      <w:proofErr w:type="spellEnd"/>
+      <w:r>
+        <w:t xml:space="preserve"> </w:t>
+      </w:r>
+      <w:proofErr w:type="spellStart"/>
+      <w:r>
+        <w:t>променама</w:t>
+      </w:r>
+      <w:proofErr w:type="spellEnd"/>
+      <w:r>
+        <w:t xml:space="preserve"> у Model-у.</w:t>
       </w:r>
     </w:p>
     <w:p>
@@ -2996,20 +4804,158 @@
         </w:numPr>
       </w:pPr>
       <w:r>
+        <w:rPr>
+          <w:b/>
+          <w:bCs/>
+        </w:rPr>
         <w:t>Event-based push:</w:t>
+      </w:r>
+      <w:r>
         <w:br/>
-        <w:t>Клијент се претплаћује на догађаје са SignalR сервера и реагује када стигну нове промене.</w:t>
-      </w:r>
-    </w:p>
-    <w:p>
-      <w:pPr>
-        <w:rPr>
-          <w:b/>
-          <w:bCs/>
-        </w:rPr>
-      </w:pPr>
-      <w:r>
-        <w:t>Библиотеке и алати:</w:t>
+      </w:r>
+      <w:proofErr w:type="spellStart"/>
+      <w:r>
+        <w:t>Клијент</w:t>
+      </w:r>
+      <w:proofErr w:type="spellEnd"/>
+      <w:r>
+        <w:t xml:space="preserve"> </w:t>
+      </w:r>
+      <w:proofErr w:type="spellStart"/>
+      <w:r>
+        <w:t>се</w:t>
+      </w:r>
+      <w:proofErr w:type="spellEnd"/>
+      <w:r>
+        <w:t xml:space="preserve"> </w:t>
+      </w:r>
+      <w:proofErr w:type="spellStart"/>
+      <w:r>
+        <w:t>претплаћује</w:t>
+      </w:r>
+      <w:proofErr w:type="spellEnd"/>
+      <w:r>
+        <w:t xml:space="preserve"> </w:t>
+      </w:r>
+      <w:proofErr w:type="spellStart"/>
+      <w:r>
+        <w:t>на</w:t>
+      </w:r>
+      <w:proofErr w:type="spellEnd"/>
+      <w:r>
+        <w:t xml:space="preserve"> </w:t>
+      </w:r>
+      <w:proofErr w:type="spellStart"/>
+      <w:r>
+        <w:t>догађаје</w:t>
+      </w:r>
+      <w:proofErr w:type="spellEnd"/>
+      <w:r>
+        <w:t xml:space="preserve"> </w:t>
+      </w:r>
+      <w:proofErr w:type="spellStart"/>
+      <w:r>
+        <w:t>са</w:t>
+      </w:r>
+      <w:proofErr w:type="spellEnd"/>
+      <w:r>
+        <w:t xml:space="preserve"> Blackboard </w:t>
+      </w:r>
+      <w:proofErr w:type="spellStart"/>
+      <w:r>
+        <w:t>сервера</w:t>
+      </w:r>
+      <w:proofErr w:type="spellEnd"/>
+      <w:r>
+        <w:t xml:space="preserve"> </w:t>
+      </w:r>
+      <w:proofErr w:type="spellStart"/>
+      <w:r>
+        <w:t>или</w:t>
+      </w:r>
+      <w:proofErr w:type="spellEnd"/>
+      <w:r>
+        <w:t xml:space="preserve"> message broker-а и </w:t>
+      </w:r>
+      <w:proofErr w:type="spellStart"/>
+      <w:r>
+        <w:t>реагује</w:t>
+      </w:r>
+      <w:proofErr w:type="spellEnd"/>
+      <w:r>
+        <w:t xml:space="preserve"> </w:t>
+      </w:r>
+      <w:proofErr w:type="spellStart"/>
+      <w:r>
+        <w:t>када</w:t>
+      </w:r>
+      <w:proofErr w:type="spellEnd"/>
+      <w:r>
+        <w:t xml:space="preserve"> </w:t>
+      </w:r>
+      <w:proofErr w:type="spellStart"/>
+      <w:r>
+        <w:t>стигну</w:t>
+      </w:r>
+      <w:proofErr w:type="spellEnd"/>
+      <w:r>
+        <w:t xml:space="preserve"> </w:t>
+      </w:r>
+      <w:proofErr w:type="spellStart"/>
+      <w:r>
+        <w:t>нови</w:t>
+      </w:r>
+      <w:proofErr w:type="spellEnd"/>
+      <w:r>
+        <w:t xml:space="preserve"> </w:t>
+      </w:r>
+      <w:proofErr w:type="spellStart"/>
+      <w:r>
+        <w:t>догађаји</w:t>
+      </w:r>
+      <w:proofErr w:type="spellEnd"/>
+      <w:r>
+        <w:t>.</w:t>
+      </w:r>
+    </w:p>
+    <w:p>
+      <w:pPr>
+        <w:rPr>
+          <w:b/>
+          <w:bCs/>
+        </w:rPr>
+      </w:pPr>
+      <w:proofErr w:type="spellStart"/>
+      <w:r>
+        <w:rPr>
+          <w:b/>
+          <w:bCs/>
+        </w:rPr>
+        <w:t>Библиотеке</w:t>
+      </w:r>
+      <w:proofErr w:type="spellEnd"/>
+      <w:r>
+        <w:rPr>
+          <w:b/>
+          <w:bCs/>
+        </w:rPr>
+        <w:t xml:space="preserve"> и </w:t>
+      </w:r>
+      <w:proofErr w:type="spellStart"/>
+      <w:r>
+        <w:rPr>
+          <w:b/>
+          <w:bCs/>
+        </w:rPr>
+        <w:t>алати</w:t>
+      </w:r>
+      <w:proofErr w:type="spellEnd"/>
+      <w:r>
+        <w:rPr>
+          <w:b/>
+          <w:bCs/>
+        </w:rPr>
+        <w:t>:</w:t>
       </w:r>
     </w:p>
     <w:p>
@@ -3020,7 +4966,70 @@
         </w:numPr>
       </w:pPr>
       <w:r>
-        <w:t>React – за компонентни кориснички интерфејс и управљање стањем.</w:t>
+        <w:rPr>
+          <w:b/>
+          <w:bCs/>
+        </w:rPr>
+        <w:t>Reactive Extensions (Rx.NET)</w:t>
+      </w:r>
+      <w:r>
+        <w:t xml:space="preserve"> – </w:t>
+      </w:r>
+      <w:proofErr w:type="spellStart"/>
+      <w:r>
+        <w:t>за</w:t>
+      </w:r>
+      <w:proofErr w:type="spellEnd"/>
+      <w:r>
+        <w:t xml:space="preserve"> </w:t>
+      </w:r>
+      <w:proofErr w:type="spellStart"/>
+      <w:r>
+        <w:t>елегантно</w:t>
+      </w:r>
+      <w:proofErr w:type="spellEnd"/>
+      <w:r>
+        <w:t xml:space="preserve"> </w:t>
+      </w:r>
+      <w:proofErr w:type="spellStart"/>
+      <w:r>
+        <w:t>управљање</w:t>
+      </w:r>
+      <w:proofErr w:type="spellEnd"/>
+      <w:r>
+        <w:t xml:space="preserve"> </w:t>
+      </w:r>
+      <w:proofErr w:type="spellStart"/>
+      <w:r>
+        <w:t>догађајима</w:t>
+      </w:r>
+      <w:proofErr w:type="spellEnd"/>
+      <w:r>
+        <w:t xml:space="preserve"> и </w:t>
+      </w:r>
+      <w:proofErr w:type="spellStart"/>
+      <w:r>
+        <w:t>асинхроним</w:t>
+      </w:r>
+      <w:proofErr w:type="spellEnd"/>
+      <w:r>
+        <w:t xml:space="preserve"> </w:t>
+      </w:r>
+      <w:proofErr w:type="spellStart"/>
+      <w:r>
+        <w:t>токовима</w:t>
+      </w:r>
+      <w:proofErr w:type="spellEnd"/>
+      <w:r>
+        <w:t xml:space="preserve"> </w:t>
+      </w:r>
+      <w:proofErr w:type="spellStart"/>
+      <w:r>
+        <w:t>података</w:t>
+      </w:r>
+      <w:proofErr w:type="spellEnd"/>
+      <w:r>
+        <w:t>.</w:t>
       </w:r>
     </w:p>
     <w:p>
@@ -3030,8 +5039,89 @@
           <w:numId w:val="15"/>
         </w:numPr>
       </w:pPr>
-      <w:r>
-        <w:t>TypeScript – за типизовану имплементацију клијента.</w:t>
+      <w:proofErr w:type="spellStart"/>
+      <w:r>
+        <w:rPr>
+          <w:b/>
+          <w:bCs/>
+        </w:rPr>
+        <w:t>Newtonsoft.Json</w:t>
+      </w:r>
+      <w:proofErr w:type="spellEnd"/>
+      <w:r>
+        <w:t xml:space="preserve"> – </w:t>
+      </w:r>
+      <w:proofErr w:type="spellStart"/>
+      <w:r>
+        <w:t>за</w:t>
+      </w:r>
+      <w:proofErr w:type="spellEnd"/>
+      <w:r>
+        <w:t xml:space="preserve"> </w:t>
+      </w:r>
+      <w:proofErr w:type="spellStart"/>
+      <w:r>
+        <w:t>серијализацију</w:t>
+      </w:r>
+      <w:proofErr w:type="spellEnd"/>
+      <w:r>
+        <w:t xml:space="preserve"> </w:t>
+      </w:r>
+      <w:proofErr w:type="spellStart"/>
+      <w:r>
+        <w:t>објеката</w:t>
+      </w:r>
+      <w:proofErr w:type="spellEnd"/>
+      <w:r>
+        <w:t xml:space="preserve"> (</w:t>
+      </w:r>
+      <w:proofErr w:type="spellStart"/>
+      <w:r>
+        <w:t>цртежа</w:t>
+      </w:r>
+      <w:proofErr w:type="spellEnd"/>
+      <w:r>
+        <w:t xml:space="preserve"> и </w:t>
+      </w:r>
+      <w:proofErr w:type="spellStart"/>
+      <w:r>
+        <w:t>порука</w:t>
+      </w:r>
+      <w:proofErr w:type="spellEnd"/>
+      <w:r>
+        <w:t xml:space="preserve">) </w:t>
+      </w:r>
+      <w:proofErr w:type="spellStart"/>
+      <w:r>
+        <w:t>приликом</w:t>
+      </w:r>
+      <w:proofErr w:type="spellEnd"/>
+      <w:r>
+        <w:t xml:space="preserve"> </w:t>
+      </w:r>
+      <w:proofErr w:type="spellStart"/>
+      <w:r>
+        <w:t>слања</w:t>
+      </w:r>
+      <w:proofErr w:type="spellEnd"/>
+      <w:r>
+        <w:t xml:space="preserve"> </w:t>
+      </w:r>
+      <w:proofErr w:type="spellStart"/>
+      <w:r>
+        <w:t>преко</w:t>
+      </w:r>
+      <w:proofErr w:type="spellEnd"/>
+      <w:r>
+        <w:t xml:space="preserve"> </w:t>
+      </w:r>
+      <w:proofErr w:type="spellStart"/>
+      <w:r>
+        <w:t>мреже</w:t>
+      </w:r>
+      <w:proofErr w:type="spellEnd"/>
+      <w:r>
+        <w:t>.</w:t>
       </w:r>
     </w:p>
     <w:p>
@@ -3041,26 +5131,251 @@
           <w:numId w:val="15"/>
         </w:numPr>
       </w:pPr>
-      <w:r>
-        <w:t>Vite, Tailwind CSS и @microsoft/signalr – за брз развој, стилизовање и real-time комуникацију.</w:t>
-      </w:r>
-    </w:p>
-    <w:p>
-      <w:pPr>
-        <w:rPr>
-          <w:b/>
-          <w:bCs/>
-        </w:rPr>
-      </w:pPr>
-      <w:r>
-        <w:t>2. Серверска компонента (ASP.NET Core backend)</w:t>
-      </w:r>
-    </w:p>
-    <w:p>
-      <w:r>
-        <w:t>Језик: C#</w:t>
+      <w:proofErr w:type="spellStart"/>
+      <w:r>
+        <w:rPr>
+          <w:b/>
+          <w:bCs/>
+        </w:rPr>
+        <w:t>ZeroMQ</w:t>
+      </w:r>
+      <w:proofErr w:type="spellEnd"/>
+      <w:r>
+        <w:rPr>
+          <w:b/>
+          <w:bCs/>
+        </w:rPr>
+        <w:t xml:space="preserve"> </w:t>
+      </w:r>
+      <w:proofErr w:type="spellStart"/>
+      <w:r>
+        <w:rPr>
+          <w:b/>
+          <w:bCs/>
+        </w:rPr>
+        <w:t>или</w:t>
+      </w:r>
+      <w:proofErr w:type="spellEnd"/>
+      <w:r>
+        <w:rPr>
+          <w:b/>
+          <w:bCs/>
+        </w:rPr>
+        <w:t xml:space="preserve"> RabbitMQ .NET </w:t>
+      </w:r>
+      <w:proofErr w:type="spellStart"/>
+      <w:r>
+        <w:rPr>
+          <w:b/>
+          <w:bCs/>
+        </w:rPr>
+        <w:t>клијент</w:t>
+      </w:r>
+      <w:proofErr w:type="spellEnd"/>
+      <w:r>
+        <w:t xml:space="preserve"> – </w:t>
+      </w:r>
+      <w:proofErr w:type="spellStart"/>
+      <w:r>
+        <w:t>за</w:t>
+      </w:r>
+      <w:proofErr w:type="spellEnd"/>
+      <w:r>
+        <w:t xml:space="preserve"> </w:t>
+      </w:r>
+      <w:proofErr w:type="spellStart"/>
+      <w:r>
+        <w:t>комуникацију</w:t>
+      </w:r>
+      <w:proofErr w:type="spellEnd"/>
+      <w:r>
+        <w:t xml:space="preserve"> </w:t>
+      </w:r>
+      <w:proofErr w:type="spellStart"/>
+      <w:r>
+        <w:t>са</w:t>
+      </w:r>
+      <w:proofErr w:type="spellEnd"/>
+      <w:r>
+        <w:t xml:space="preserve"> </w:t>
+      </w:r>
+      <w:proofErr w:type="spellStart"/>
+      <w:r>
+        <w:t>сервером</w:t>
+      </w:r>
+      <w:proofErr w:type="spellEnd"/>
+      <w:r>
+        <w:t xml:space="preserve"> / broker-</w:t>
+      </w:r>
+      <w:proofErr w:type="spellStart"/>
+      <w:r>
+        <w:t>ом</w:t>
+      </w:r>
+      <w:proofErr w:type="spellEnd"/>
+      <w:r>
+        <w:t>.</w:t>
+      </w:r>
+    </w:p>
+    <w:p>
+      <w:pPr>
+        <w:rPr>
+          <w:b/>
+          <w:bCs/>
+        </w:rPr>
+      </w:pPr>
+      <w:r>
+        <w:rPr>
+          <w:b/>
+          <w:bCs/>
+        </w:rPr>
+        <w:t xml:space="preserve">2. </w:t>
+      </w:r>
+      <w:proofErr w:type="spellStart"/>
+      <w:r>
+        <w:rPr>
+          <w:b/>
+          <w:bCs/>
+        </w:rPr>
+        <w:t>Серверска</w:t>
+      </w:r>
+      <w:proofErr w:type="spellEnd"/>
+      <w:r>
+        <w:rPr>
+          <w:b/>
+          <w:bCs/>
+        </w:rPr>
+        <w:t xml:space="preserve"> </w:t>
+      </w:r>
+      <w:proofErr w:type="spellStart"/>
+      <w:r>
+        <w:rPr>
+          <w:b/>
+          <w:bCs/>
+        </w:rPr>
+        <w:t>компонента</w:t>
+      </w:r>
+      <w:proofErr w:type="spellEnd"/>
+      <w:r>
+        <w:rPr>
+          <w:b/>
+          <w:bCs/>
+        </w:rPr>
+        <w:t xml:space="preserve"> (</w:t>
+      </w:r>
+      <w:proofErr w:type="spellStart"/>
+      <w:r>
+        <w:rPr>
+          <w:b/>
+          <w:bCs/>
+        </w:rPr>
+        <w:t>дистрибуирани</w:t>
+      </w:r>
+      <w:proofErr w:type="spellEnd"/>
+      <w:r>
+        <w:rPr>
+          <w:b/>
+          <w:bCs/>
+        </w:rPr>
+        <w:t xml:space="preserve"> </w:t>
+      </w:r>
+      <w:proofErr w:type="spellStart"/>
+      <w:r>
+        <w:rPr>
+          <w:b/>
+          <w:bCs/>
+        </w:rPr>
+        <w:t>сервер</w:t>
+      </w:r>
+      <w:proofErr w:type="spellEnd"/>
+      <w:r>
+        <w:rPr>
+          <w:b/>
+          <w:bCs/>
+        </w:rPr>
+        <w:t xml:space="preserve"> / Blackboard)</w:t>
+      </w:r>
+    </w:p>
+    <w:p>
+      <w:proofErr w:type="spellStart"/>
+      <w:r>
+        <w:rPr>
+          <w:b/>
+          <w:bCs/>
+        </w:rPr>
+        <w:t>Језик</w:t>
+      </w:r>
+      <w:proofErr w:type="spellEnd"/>
+      <w:r>
+        <w:rPr>
+          <w:b/>
+          <w:bCs/>
+        </w:rPr>
+        <w:t>:</w:t>
+      </w:r>
+      <w:r>
+        <w:t xml:space="preserve"> C#</w:t>
+      </w:r>
+      <w:r>
         <w:br/>
-        <w:t>Тип апликације: ASP.NET Core Web API + SignalR hub</w:t>
+      </w:r>
+      <w:proofErr w:type="spellStart"/>
+      <w:r>
+        <w:rPr>
+          <w:b/>
+          <w:bCs/>
+        </w:rPr>
+        <w:t>Тип</w:t>
+      </w:r>
+      <w:proofErr w:type="spellEnd"/>
+      <w:r>
+        <w:rPr>
+          <w:b/>
+          <w:bCs/>
+        </w:rPr>
+        <w:t xml:space="preserve"> </w:t>
+      </w:r>
+      <w:proofErr w:type="spellStart"/>
+      <w:r>
+        <w:rPr>
+          <w:b/>
+          <w:bCs/>
+        </w:rPr>
+        <w:t>апликације</w:t>
+      </w:r>
+      <w:proofErr w:type="spellEnd"/>
+      <w:r>
+        <w:rPr>
+          <w:b/>
+          <w:bCs/>
+        </w:rPr>
+        <w:t>:</w:t>
+      </w:r>
+      <w:r>
+        <w:t xml:space="preserve"> </w:t>
+      </w:r>
+      <w:proofErr w:type="spellStart"/>
+      <w:r>
+        <w:t>конзолна</w:t>
+      </w:r>
+      <w:proofErr w:type="spellEnd"/>
+      <w:r>
+        <w:t xml:space="preserve"> </w:t>
+      </w:r>
+      <w:proofErr w:type="spellStart"/>
+      <w:r>
+        <w:t>или</w:t>
+      </w:r>
+      <w:proofErr w:type="spellEnd"/>
+      <w:r>
+        <w:t xml:space="preserve"> </w:t>
+      </w:r>
+      <w:proofErr w:type="spellStart"/>
+      <w:r>
+        <w:t>сервисна</w:t>
+      </w:r>
+      <w:proofErr w:type="spellEnd"/>
+      <w:r>
+        <w:t xml:space="preserve"> (.NET)</w:t>
       </w:r>
     </w:p>
     <w:p>
@@ -3143,9 +5458,94 @@
         </w:numPr>
       </w:pPr>
       <w:r>
-        <w:t>Client-server / Repository образац:</w:t>
+        <w:rPr>
+          <w:b/>
+          <w:bCs/>
+        </w:rPr>
+        <w:t xml:space="preserve">Blackboard / Repository </w:t>
+      </w:r>
+      <w:proofErr w:type="spellStart"/>
+      <w:r>
+        <w:rPr>
+          <w:b/>
+          <w:bCs/>
+        </w:rPr>
+        <w:t>образац</w:t>
+      </w:r>
+      <w:proofErr w:type="spellEnd"/>
+      <w:r>
+        <w:rPr>
+          <w:b/>
+          <w:bCs/>
+        </w:rPr>
+        <w:t>:</w:t>
+      </w:r>
+      <w:r>
         <w:br/>
-        <w:t>Централизовано управљање стањем табле, историјом цртежа и chat порука кроз серверски API и базу података.</w:t>
+      </w:r>
+      <w:proofErr w:type="spellStart"/>
+      <w:r>
+        <w:t>Централизовано</w:t>
+      </w:r>
+      <w:proofErr w:type="spellEnd"/>
+      <w:r>
+        <w:t xml:space="preserve"> </w:t>
+      </w:r>
+      <w:proofErr w:type="spellStart"/>
+      <w:r>
+        <w:t>активно</w:t>
+      </w:r>
+      <w:proofErr w:type="spellEnd"/>
+      <w:r>
+        <w:t xml:space="preserve"> </w:t>
+      </w:r>
+      <w:proofErr w:type="spellStart"/>
+      <w:r>
+        <w:t>складиште</w:t>
+      </w:r>
+      <w:proofErr w:type="spellEnd"/>
+      <w:r>
+        <w:t xml:space="preserve"> </w:t>
+      </w:r>
+      <w:proofErr w:type="spellStart"/>
+      <w:r>
+        <w:t>стања</w:t>
+      </w:r>
+      <w:proofErr w:type="spellEnd"/>
+      <w:r>
+        <w:t xml:space="preserve"> </w:t>
+      </w:r>
+      <w:proofErr w:type="spellStart"/>
+      <w:r>
+        <w:t>табле</w:t>
+      </w:r>
+      <w:proofErr w:type="spellEnd"/>
+      <w:r>
+        <w:t xml:space="preserve">, </w:t>
+      </w:r>
+      <w:proofErr w:type="spellStart"/>
+      <w:r>
+        <w:t>историје</w:t>
+      </w:r>
+      <w:proofErr w:type="spellEnd"/>
+      <w:r>
+        <w:t xml:space="preserve"> </w:t>
+      </w:r>
+      <w:proofErr w:type="spellStart"/>
+      <w:r>
+        <w:t>цртежа</w:t>
+      </w:r>
+      <w:proofErr w:type="spellEnd"/>
+      <w:r>
+        <w:t xml:space="preserve"> и chat </w:t>
+      </w:r>
+      <w:proofErr w:type="spellStart"/>
+      <w:r>
+        <w:t>порука</w:t>
+      </w:r>
+      <w:proofErr w:type="spellEnd"/>
+      <w:r>
+        <w:t>.</w:t>
       </w:r>
     </w:p>
     <w:p>
@@ -3156,20 +5556,118 @@
         </w:numPr>
       </w:pPr>
       <w:r>
+        <w:rPr>
+          <w:b/>
+          <w:bCs/>
+        </w:rPr>
         <w:t>Implicit Invocation / Event push:</w:t>
+      </w:r>
+      <w:r>
         <w:br/>
-        <w:t>Сервер преко SignalR-а одлучује када ће клијентима послати нове догађаје.</w:t>
-      </w:r>
-    </w:p>
-    <w:p>
-      <w:pPr>
-        <w:rPr>
-          <w:b/>
-          <w:bCs/>
-        </w:rPr>
-      </w:pPr>
-      <w:r>
-        <w:t>Библиотеке и алати:</w:t>
+      </w:r>
+      <w:proofErr w:type="spellStart"/>
+      <w:r>
+        <w:t>Сервер</w:t>
+      </w:r>
+      <w:proofErr w:type="spellEnd"/>
+      <w:r>
+        <w:t xml:space="preserve"> (Blackboard) </w:t>
+      </w:r>
+      <w:proofErr w:type="spellStart"/>
+      <w:r>
+        <w:t>одлучује</w:t>
+      </w:r>
+      <w:proofErr w:type="spellEnd"/>
+      <w:r>
+        <w:t xml:space="preserve"> </w:t>
+      </w:r>
+      <w:proofErr w:type="spellStart"/>
+      <w:r>
+        <w:t>када</w:t>
+      </w:r>
+      <w:proofErr w:type="spellEnd"/>
+      <w:r>
+        <w:t xml:space="preserve"> </w:t>
+      </w:r>
+      <w:proofErr w:type="spellStart"/>
+      <w:r>
+        <w:t>ће</w:t>
+      </w:r>
+      <w:proofErr w:type="spellEnd"/>
+      <w:r>
+        <w:t xml:space="preserve"> </w:t>
+      </w:r>
+      <w:proofErr w:type="spellStart"/>
+      <w:r>
+        <w:t>клијентима</w:t>
+      </w:r>
+      <w:proofErr w:type="spellEnd"/>
+      <w:r>
+        <w:t xml:space="preserve"> </w:t>
+      </w:r>
+      <w:proofErr w:type="spellStart"/>
+      <w:r>
+        <w:t>послати</w:t>
+      </w:r>
+      <w:proofErr w:type="spellEnd"/>
+      <w:r>
+        <w:t xml:space="preserve"> </w:t>
+      </w:r>
+      <w:proofErr w:type="spellStart"/>
+      <w:r>
+        <w:t>нове</w:t>
+      </w:r>
+      <w:proofErr w:type="spellEnd"/>
+      <w:r>
+        <w:t xml:space="preserve"> </w:t>
+      </w:r>
+      <w:proofErr w:type="spellStart"/>
+      <w:r>
+        <w:t>догађаје</w:t>
+      </w:r>
+      <w:proofErr w:type="spellEnd"/>
+      <w:r>
+        <w:t>.</w:t>
+      </w:r>
+    </w:p>
+    <w:p>
+      <w:pPr>
+        <w:rPr>
+          <w:b/>
+          <w:bCs/>
+        </w:rPr>
+      </w:pPr>
+      <w:proofErr w:type="spellStart"/>
+      <w:r>
+        <w:rPr>
+          <w:b/>
+          <w:bCs/>
+        </w:rPr>
+        <w:t>Библиотеке</w:t>
+      </w:r>
+      <w:proofErr w:type="spellEnd"/>
+      <w:r>
+        <w:rPr>
+          <w:b/>
+          <w:bCs/>
+        </w:rPr>
+        <w:t xml:space="preserve"> и </w:t>
+      </w:r>
+      <w:proofErr w:type="spellStart"/>
+      <w:r>
+        <w:rPr>
+          <w:b/>
+          <w:bCs/>
+        </w:rPr>
+        <w:t>алати</w:t>
+      </w:r>
+      <w:proofErr w:type="spellEnd"/>
+      <w:r>
+        <w:rPr>
+          <w:b/>
+          <w:bCs/>
+        </w:rPr>
+        <w:t>:</w:t>
       </w:r>
     </w:p>
     <w:p>
@@ -3179,8 +5677,81 @@
           <w:numId w:val="17"/>
         </w:numPr>
       </w:pPr>
-      <w:r>
-        <w:t>ASP.NET Core SignalR – за дистрибуцију догађаја ка свим клијентима.</w:t>
+      <w:proofErr w:type="spellStart"/>
+      <w:r>
+        <w:rPr>
+          <w:b/>
+          <w:bCs/>
+        </w:rPr>
+        <w:t>ZeroMQ</w:t>
+      </w:r>
+      <w:proofErr w:type="spellEnd"/>
+      <w:r>
+        <w:rPr>
+          <w:b/>
+          <w:bCs/>
+        </w:rPr>
+        <w:t xml:space="preserve"> / RabbitMQ .NET </w:t>
+      </w:r>
+      <w:proofErr w:type="spellStart"/>
+      <w:r>
+        <w:rPr>
+          <w:b/>
+          <w:bCs/>
+        </w:rPr>
+        <w:t>клијент</w:t>
+      </w:r>
+      <w:proofErr w:type="spellEnd"/>
+      <w:r>
+        <w:t xml:space="preserve"> – </w:t>
+      </w:r>
+      <w:proofErr w:type="spellStart"/>
+      <w:r>
+        <w:t>за</w:t>
+      </w:r>
+      <w:proofErr w:type="spellEnd"/>
+      <w:r>
+        <w:t xml:space="preserve"> </w:t>
+      </w:r>
+      <w:proofErr w:type="spellStart"/>
+      <w:r>
+        <w:t>дистрибуцију</w:t>
+      </w:r>
+      <w:proofErr w:type="spellEnd"/>
+      <w:r>
+        <w:t xml:space="preserve"> </w:t>
+      </w:r>
+      <w:proofErr w:type="spellStart"/>
+      <w:r>
+        <w:t>догађаја</w:t>
+      </w:r>
+      <w:proofErr w:type="spellEnd"/>
+      <w:r>
+        <w:t xml:space="preserve"> </w:t>
+      </w:r>
+      <w:proofErr w:type="spellStart"/>
+      <w:r>
+        <w:t>ка</w:t>
+      </w:r>
+      <w:proofErr w:type="spellEnd"/>
+      <w:r>
+        <w:t xml:space="preserve"> </w:t>
+      </w:r>
+      <w:proofErr w:type="spellStart"/>
+      <w:r>
+        <w:t>свим</w:t>
+      </w:r>
+      <w:proofErr w:type="spellEnd"/>
+      <w:r>
+        <w:t xml:space="preserve"> </w:t>
+      </w:r>
+      <w:proofErr w:type="spellStart"/>
+      <w:r>
+        <w:t>клијентима</w:t>
+      </w:r>
+      <w:proofErr w:type="spellEnd"/>
+      <w:r>
+        <w:t>.</w:t>
       </w:r>
     </w:p>
     <w:p>
@@ -3191,7 +5762,78 @@
         </w:numPr>
       </w:pPr>
       <w:r>
-        <w:t>Entity Framework Core и SQL Server – за перзистенцију података у централизованој бази.</w:t>
+        <w:rPr>
+          <w:b/>
+          <w:bCs/>
+        </w:rPr>
+        <w:t>Entity Framework Core</w:t>
+      </w:r>
+      <w:r>
+        <w:t xml:space="preserve"> – </w:t>
+      </w:r>
+      <w:proofErr w:type="spellStart"/>
+      <w:r>
+        <w:t>за</w:t>
+      </w:r>
+      <w:proofErr w:type="spellEnd"/>
+      <w:r>
+        <w:t xml:space="preserve"> </w:t>
+      </w:r>
+      <w:proofErr w:type="spellStart"/>
+      <w:r>
+        <w:t>перзистенцију</w:t>
+      </w:r>
+      <w:proofErr w:type="spellEnd"/>
+      <w:r>
+        <w:t xml:space="preserve"> </w:t>
+      </w:r>
+      <w:proofErr w:type="spellStart"/>
+      <w:r>
+        <w:t>података</w:t>
+      </w:r>
+      <w:proofErr w:type="spellEnd"/>
+      <w:r>
+        <w:t xml:space="preserve"> у </w:t>
+      </w:r>
+      <w:proofErr w:type="spellStart"/>
+      <w:r>
+        <w:t>локалној</w:t>
+      </w:r>
+      <w:proofErr w:type="spellEnd"/>
+      <w:r>
+        <w:t xml:space="preserve"> </w:t>
+      </w:r>
+      <w:proofErr w:type="spellStart"/>
+      <w:r>
+        <w:t>или</w:t>
+      </w:r>
+      <w:proofErr w:type="spellEnd"/>
+      <w:r>
+        <w:t xml:space="preserve"> </w:t>
+      </w:r>
+      <w:proofErr w:type="spellStart"/>
+      <w:r>
+        <w:t>удаљеној</w:t>
+      </w:r>
+      <w:proofErr w:type="spellEnd"/>
+      <w:r>
+        <w:t xml:space="preserve"> </w:t>
+      </w:r>
+      <w:proofErr w:type="spellStart"/>
+      <w:r>
+        <w:t>бази</w:t>
+      </w:r>
+      <w:proofErr w:type="spellEnd"/>
+      <w:r>
+        <w:t xml:space="preserve"> </w:t>
+      </w:r>
+      <w:proofErr w:type="spellStart"/>
+      <w:r>
+        <w:t>података</w:t>
+      </w:r>
+      <w:proofErr w:type="spellEnd"/>
+      <w:r>
+        <w:t>.</w:t>
       </w:r>
     </w:p>
     <w:p>
@@ -3242,7 +5884,114 @@
         </w:numPr>
       </w:pPr>
       <w:r>
-        <w:t>React образац се примењује само на клијентску UI логику, док сервер користи ASP.NET Core + SignalR за real-time комуникацију.</w:t>
+        <w:rPr>
+          <w:b/>
+          <w:bCs/>
+        </w:rPr>
+        <w:t xml:space="preserve">MVVM </w:t>
+      </w:r>
+      <w:proofErr w:type="spellStart"/>
+      <w:r>
+        <w:rPr>
+          <w:b/>
+          <w:bCs/>
+        </w:rPr>
+        <w:t>образац</w:t>
+      </w:r>
+      <w:proofErr w:type="spellEnd"/>
+      <w:r>
+        <w:t xml:space="preserve"> </w:t>
+      </w:r>
+      <w:proofErr w:type="spellStart"/>
+      <w:r>
+        <w:t>се</w:t>
+      </w:r>
+      <w:proofErr w:type="spellEnd"/>
+      <w:r>
+        <w:t xml:space="preserve"> </w:t>
+      </w:r>
+      <w:proofErr w:type="spellStart"/>
+      <w:r>
+        <w:t>примењује</w:t>
+      </w:r>
+      <w:proofErr w:type="spellEnd"/>
+      <w:r>
+        <w:t xml:space="preserve"> </w:t>
+      </w:r>
+      <w:proofErr w:type="spellStart"/>
+      <w:r>
+        <w:t>искључиво</w:t>
+      </w:r>
+      <w:proofErr w:type="spellEnd"/>
+      <w:r>
+        <w:t xml:space="preserve"> </w:t>
+      </w:r>
+      <w:proofErr w:type="spellStart"/>
+      <w:r>
+        <w:t>на</w:t>
+      </w:r>
+      <w:proofErr w:type="spellEnd"/>
+      <w:r>
+        <w:t xml:space="preserve"> </w:t>
+      </w:r>
+      <w:proofErr w:type="spellStart"/>
+      <w:r>
+        <w:t>клијентску</w:t>
+      </w:r>
+      <w:proofErr w:type="spellEnd"/>
+      <w:r>
+        <w:t xml:space="preserve"> GUI </w:t>
+      </w:r>
+      <w:proofErr w:type="spellStart"/>
+      <w:r>
+        <w:t>логику</w:t>
+      </w:r>
+      <w:proofErr w:type="spellEnd"/>
+      <w:r>
+        <w:t xml:space="preserve">, </w:t>
+      </w:r>
+      <w:proofErr w:type="spellStart"/>
+      <w:r>
+        <w:t>док</w:t>
+      </w:r>
+      <w:proofErr w:type="spellEnd"/>
+      <w:r>
+        <w:t xml:space="preserve"> </w:t>
+      </w:r>
+      <w:proofErr w:type="spellStart"/>
+      <w:r>
+        <w:t>сервер</w:t>
+      </w:r>
+      <w:proofErr w:type="spellEnd"/>
+      <w:r>
+        <w:t xml:space="preserve"> </w:t>
+      </w:r>
+      <w:proofErr w:type="spellStart"/>
+      <w:r>
+        <w:t>користи</w:t>
+      </w:r>
+      <w:proofErr w:type="spellEnd"/>
+      <w:r>
+        <w:t xml:space="preserve"> </w:t>
+      </w:r>
+      <w:r>
+        <w:rPr>
+          <w:b/>
+          <w:bCs/>
+        </w:rPr>
+        <w:t xml:space="preserve">Blackboard + Event push </w:t>
+      </w:r>
+      <w:proofErr w:type="spellStart"/>
+      <w:r>
+        <w:rPr>
+          <w:b/>
+          <w:bCs/>
+        </w:rPr>
+        <w:t>архитектуру</w:t>
+      </w:r>
+      <w:proofErr w:type="spellEnd"/>
+      <w:r>
+        <w:t>.</w:t>
       </w:r>
     </w:p>
     <w:p>
@@ -3252,8 +6001,29 @@
           <w:numId w:val="18"/>
         </w:numPr>
       </w:pPr>
-      <w:r>
-        <w:t>Оваква комбинација омогућава:</w:t>
+      <w:proofErr w:type="spellStart"/>
+      <w:r>
+        <w:t>Оваква</w:t>
+      </w:r>
+      <w:proofErr w:type="spellEnd"/>
+      <w:r>
+        <w:t xml:space="preserve"> </w:t>
+      </w:r>
+      <w:proofErr w:type="spellStart"/>
+      <w:r>
+        <w:t>комбинација</w:t>
+      </w:r>
+      <w:proofErr w:type="spellEnd"/>
+      <w:r>
+        <w:t xml:space="preserve"> </w:t>
+      </w:r>
+      <w:proofErr w:type="spellStart"/>
+      <w:r>
+        <w:t>омогућава</w:t>
+      </w:r>
+      <w:proofErr w:type="spellEnd"/>
+      <w:r>
+        <w:t>:</w:t>
       </w:r>
     </w:p>
     <w:p>
@@ -3263,9 +6033,35 @@
           <w:numId w:val="18"/>
         </w:numPr>
       </w:pPr>
-      <w:r>
-        <w:t>Јасну модуларност и сепарацију одговорности</w:t>
-      </w:r>
+      <w:proofErr w:type="spellStart"/>
+      <w:r>
+        <w:t>Јасну</w:t>
+      </w:r>
+      <w:proofErr w:type="spellEnd"/>
+      <w:r>
+        <w:t xml:space="preserve"> </w:t>
+      </w:r>
+      <w:proofErr w:type="spellStart"/>
+      <w:r>
+        <w:t>модуларност</w:t>
+      </w:r>
+      <w:proofErr w:type="spellEnd"/>
+      <w:r>
+        <w:t xml:space="preserve"> и </w:t>
+      </w:r>
+      <w:proofErr w:type="spellStart"/>
+      <w:r>
+        <w:t>сепарацију</w:t>
+      </w:r>
+      <w:proofErr w:type="spellEnd"/>
+      <w:r>
+        <w:t xml:space="preserve"> </w:t>
+      </w:r>
+      <w:proofErr w:type="spellStart"/>
+      <w:r>
+        <w:t>одговорности</w:t>
+      </w:r>
+      <w:proofErr w:type="spellEnd"/>
     </w:p>
     <w:p>
       <w:pPr>
@@ -3274,8 +6070,78 @@
           <w:numId w:val="18"/>
         </w:numPr>
       </w:pPr>
-      <w:r>
-        <w:t>Једноставно проширење система (додавање нових типова објеката или догађаја)</w:t>
+      <w:proofErr w:type="spellStart"/>
+      <w:r>
+        <w:lastRenderedPageBreak/>
+        <w:t>Једноставно</w:t>
+      </w:r>
+      <w:proofErr w:type="spellEnd"/>
+      <w:r>
+        <w:t xml:space="preserve"> </w:t>
+      </w:r>
+      <w:proofErr w:type="spellStart"/>
+      <w:r>
+        <w:t>проширење</w:t>
+      </w:r>
+      <w:proofErr w:type="spellEnd"/>
+      <w:r>
+        <w:t xml:space="preserve"> </w:t>
+      </w:r>
+      <w:proofErr w:type="spellStart"/>
+      <w:r>
+        <w:t>система</w:t>
+      </w:r>
+      <w:proofErr w:type="spellEnd"/>
+      <w:r>
+        <w:t xml:space="preserve"> (</w:t>
+      </w:r>
+      <w:proofErr w:type="spellStart"/>
+      <w:r>
+        <w:t>додавање</w:t>
+      </w:r>
+      <w:proofErr w:type="spellEnd"/>
+      <w:r>
+        <w:t xml:space="preserve"> </w:t>
+      </w:r>
+      <w:proofErr w:type="spellStart"/>
+      <w:r>
+        <w:t>нових</w:t>
+      </w:r>
+      <w:proofErr w:type="spellEnd"/>
+      <w:r>
+        <w:t xml:space="preserve"> </w:t>
+      </w:r>
+      <w:proofErr w:type="spellStart"/>
+      <w:r>
+        <w:t>типова</w:t>
+      </w:r>
+      <w:proofErr w:type="spellEnd"/>
+      <w:r>
+        <w:t xml:space="preserve"> </w:t>
+      </w:r>
+      <w:proofErr w:type="spellStart"/>
+      <w:r>
+        <w:t>објеката</w:t>
+      </w:r>
+      <w:proofErr w:type="spellEnd"/>
+      <w:r>
+        <w:t xml:space="preserve"> </w:t>
+      </w:r>
+      <w:proofErr w:type="spellStart"/>
+      <w:r>
+        <w:t>или</w:t>
+      </w:r>
+      <w:proofErr w:type="spellEnd"/>
+      <w:r>
+        <w:t xml:space="preserve"> </w:t>
+      </w:r>
+      <w:proofErr w:type="spellStart"/>
+      <w:r>
+        <w:t>догађаја</w:t>
+      </w:r>
+      <w:proofErr w:type="spellEnd"/>
+      <w:r>
+        <w:t>)</w:t>
       </w:r>
     </w:p>
     <w:p>
@@ -3285,9 +6151,43 @@
           <w:numId w:val="18"/>
         </w:numPr>
       </w:pPr>
-      <w:r>
-        <w:t>Поуздану и real-time дистрибуцију догађаја свим корисницима</w:t>
-      </w:r>
+      <w:proofErr w:type="spellStart"/>
+      <w:r>
+        <w:t>Поуздану</w:t>
+      </w:r>
+      <w:proofErr w:type="spellEnd"/>
+      <w:r>
+        <w:t xml:space="preserve"> и real-time </w:t>
+      </w:r>
+      <w:proofErr w:type="spellStart"/>
+      <w:r>
+        <w:t>дистрибуцију</w:t>
+      </w:r>
+      <w:proofErr w:type="spellEnd"/>
+      <w:r>
+        <w:t xml:space="preserve"> </w:t>
+      </w:r>
+      <w:proofErr w:type="spellStart"/>
+      <w:r>
+        <w:t>догађаја</w:t>
+      </w:r>
+      <w:proofErr w:type="spellEnd"/>
+      <w:r>
+        <w:t xml:space="preserve"> </w:t>
+      </w:r>
+      <w:proofErr w:type="spellStart"/>
+      <w:r>
+        <w:t>свим</w:t>
+      </w:r>
+      <w:proofErr w:type="spellEnd"/>
+      <w:r>
+        <w:t xml:space="preserve"> </w:t>
+      </w:r>
+      <w:proofErr w:type="spellStart"/>
+      <w:r>
+        <w:t>корисницима</w:t>
+      </w:r>
+      <w:proofErr w:type="spellEnd"/>
     </w:p>
     <w:p>
       <w:pPr>

</xml_diff>